<commit_message>
add  more result and conclusion
</commit_message>
<xml_diff>
--- a/Fall Detection by Eden Amran and Ziv Shamli update.docx
+++ b/Fall Detection by Eden Amran and Ziv Shamli update.docx
@@ -60,6 +60,9 @@
         <w:jc w:val="center"/>
       </w:pPr>
       <w:r>
+        <w:t xml:space="preserve"> By </w:t>
+      </w:r>
+      <w:r>
         <w:t xml:space="preserve">Eden </w:t>
       </w:r>
       <w:r>
@@ -366,15 +369,7 @@
       </w:r>
       <w:proofErr w:type="spellEnd"/>
       <w:r>
-        <w:t xml:space="preserve"> in each frame, which are then connected to form a skeleton representation. From the skeleton, features such as body angles, leg angles, and height–width ratio </w:t>
-      </w:r>
-      <w:proofErr w:type="gramStart"/>
-      <w:r>
-        <w:t>are</w:t>
-      </w:r>
-      <w:proofErr w:type="gramEnd"/>
-      <w:r>
-        <w:t xml:space="preserve"> computed to detect falls and abnormal postures. Advantages of this approach include robustness to background noise and partial occlusions, low dependency on color or texture, and high accuracy under good lighting conditions (up to 98.4%). Limitations include poor performance in low-light environments, high computational requirements (GPU), and the risk of false alarms, particularly in complex scenes.</w:t>
+        <w:t xml:space="preserve"> in each frame, which are then connected to form a skeleton representation. From the skeleton, features such as body angles, leg angles, and height–width ratio are computed to detect falls and abnormal postures. Advantages of this approach include robustness to background noise and partial occlusions, low dependency on color or texture, and high accuracy under good lighting conditions (up to 98.4%). Limitations include poor performance in low-light environments, high computational requirements (GPU), and the risk of false alarms, particularly in complex scenes.</w:t>
       </w:r>
     </w:p>
     <w:p>
@@ -434,48 +429,51 @@
     </w:p>
     <w:p>
       <w:pPr>
-        <w:bidi w:val="0"/>
-      </w:pPr>
-      <w:r>
+        <w:pStyle w:val="3"/>
+        <w:bidi w:val="0"/>
         <w:rPr>
           <w:rStyle w:val="30"/>
           <w:b/>
           <w:bCs/>
           <w:color w:val="auto"/>
         </w:rPr>
+      </w:pPr>
+      <w:r>
+        <w:rPr>
+          <w:rStyle w:val="30"/>
+          <w:b/>
+          <w:bCs/>
+          <w:color w:val="auto"/>
+        </w:rPr>
         <w:lastRenderedPageBreak/>
         <w:t>Research Question</w:t>
       </w:r>
-      <w:r>
-        <w:br/>
-      </w:r>
-      <w:r>
-        <w:rPr>
-          <w:i/>
-          <w:iCs/>
-        </w:rPr>
-        <w:t>“How does training with generative images of outdoor and crowded environments impact the generalization, accuracy, sensitivity, and robustness of a fall detection model across indoor and outdoor settings?”</w:t>
-      </w:r>
-    </w:p>
-    <w:p>
-      <w:pPr>
-        <w:pStyle w:val="4"/>
-        <w:bidi w:val="0"/>
+    </w:p>
+    <w:p>
+      <w:pPr>
+        <w:bidi w:val="0"/>
+      </w:pPr>
+      <w:r>
+        <w:t>"</w:t>
+      </w:r>
+      <w:r>
+        <w:t xml:space="preserve">How does training with generative images of outdoor and crowded environments impact the generalization, accuracy, sensitivity, and robustness of a fall detection model across indoor and outdoor </w:t>
+      </w:r>
+      <w:r>
+        <w:t>settings?</w:t>
+      </w:r>
+      <w:r>
+        <w:t>"</w:t>
+      </w:r>
+    </w:p>
+    <w:p>
+      <w:pPr>
+        <w:bidi w:val="0"/>
+      </w:pPr>
+      <w:r>
         <w:rPr>
           <w:b/>
           <w:bCs/>
-          <w:i w:val="0"/>
-          <w:iCs w:val="0"/>
-          <w:color w:val="auto"/>
-        </w:rPr>
-      </w:pPr>
-      <w:r>
-        <w:rPr>
-          <w:b/>
-          <w:bCs/>
-          <w:i w:val="0"/>
-          <w:iCs w:val="0"/>
-          <w:color w:val="auto"/>
         </w:rPr>
         <w:t>Datasets:</w:t>
       </w:r>
@@ -504,7 +502,7 @@
         <w:br/>
         <w:t xml:space="preserve">Link: </w:t>
       </w:r>
-      <w:hyperlink r:id="rId7" w:history="1">
+      <w:hyperlink r:id="rId8" w:history="1">
         <w:r>
           <w:rPr>
             <w:rStyle w:val="Hyperlink"/>
@@ -549,7 +547,7 @@
       <w:r>
         <w:fldChar w:fldCharType="separate"/>
       </w:r>
-      <w:hyperlink r:id="rId8" w:history="1">
+      <w:hyperlink r:id="rId9" w:history="1">
         <w:r>
           <w:rPr>
             <w:rStyle w:val="Hyperlink"/>
@@ -585,7 +583,7 @@
         <w:br/>
         <w:t xml:space="preserve">Link: </w:t>
       </w:r>
-      <w:hyperlink r:id="rId9" w:history="1">
+      <w:hyperlink r:id="rId10" w:history="1">
         <w:r>
           <w:rPr>
             <w:rStyle w:val="Hyperlink"/>
@@ -620,7 +618,7 @@
         <w:br/>
         <w:t xml:space="preserve">Link: </w:t>
       </w:r>
-      <w:hyperlink r:id="rId10" w:history="1">
+      <w:hyperlink r:id="rId11" w:history="1">
         <w:proofErr w:type="spellStart"/>
         <w:r>
           <w:rPr>
@@ -1800,15 +1798,7 @@
         <w:t>⁵</w:t>
       </w:r>
       <w:r>
-        <w:t xml:space="preserve"> and no weight decay, and a </w:t>
-      </w:r>
-      <w:proofErr w:type="spellStart"/>
-      <w:r>
-        <w:t>StepLR</w:t>
-      </w:r>
-      <w:proofErr w:type="spellEnd"/>
-      <w:r>
-        <w:t xml:space="preserve"> scheduler is used to reduce the learning rate every four epochs. The batch size is set to 16. Each training iteration consists of a forward pass, loss computation, backpropagation, and parameter updates, with the training loss averaged per epoch.</w:t>
+        <w:t xml:space="preserve"> and no weight decay, and a StepLR scheduler is used to reduce the learning rate every four epochs. The batch size is set to 16. Each training iteration consists of a forward pass, loss computation, backpropagation, and parameter updates, with the training loss averaged per epoch.</w:t>
       </w:r>
     </w:p>
     <w:p>
@@ -1848,15 +1838,59 @@
           <w:b/>
           <w:bCs/>
         </w:rPr>
-        <w:t>Test Set Design</w:t>
-      </w:r>
-    </w:p>
-    <w:p>
-      <w:pPr>
-        <w:bidi w:val="0"/>
-      </w:pPr>
-      <w:r>
-        <w:t>Each model is evaluated using a dedicated test set that combines real indoor images not seen during training with synthetic images generated by the same generative model used for fine-tuning. For example, a model fine-tuned on Stable Diffusion is evaluated on a test set consisting of both indoor data and Stable Diffusion–generated images. This testing strategy enables precise assessment of the model’s performance on real data while also measuring its alignment with the corresponding synthetic domain.</w:t>
+        <w:t>Test Set</w:t>
+      </w:r>
+      <w:r>
+        <w:rPr>
+          <w:b/>
+          <w:bCs/>
+        </w:rPr>
+        <w:t>s</w:t>
+      </w:r>
+      <w:r>
+        <w:rPr>
+          <w:b/>
+          <w:bCs/>
+        </w:rPr>
+        <w:t xml:space="preserve"> Design</w:t>
+      </w:r>
+    </w:p>
+    <w:p>
+      <w:pPr>
+        <w:bidi w:val="0"/>
+      </w:pPr>
+      <w:r>
+        <w:t xml:space="preserve">Each model is evaluated using </w:t>
+      </w:r>
+      <w:proofErr w:type="gramStart"/>
+      <w:r>
+        <w:t>a dedicated</w:t>
+      </w:r>
+      <w:proofErr w:type="gramEnd"/>
+      <w:r>
+        <w:t xml:space="preserve"> test set</w:t>
+      </w:r>
+      <w:r>
+        <w:t>s</w:t>
+      </w:r>
+      <w:r>
+        <w:t xml:space="preserve"> that </w:t>
+      </w:r>
+      <w:proofErr w:type="gramStart"/>
+      <w:r>
+        <w:t>combines</w:t>
+      </w:r>
+      <w:proofErr w:type="gramEnd"/>
+      <w:r>
+        <w:t xml:space="preserve"> real indoor images not seen during training with synthetic images generated by the same generative model used for fine-tuning. For example, a </w:t>
+      </w:r>
+      <w:proofErr w:type="gramStart"/>
+      <w:r>
+        <w:t>model fine-tuned</w:t>
+      </w:r>
+      <w:proofErr w:type="gramEnd"/>
+      <w:r>
+        <w:t xml:space="preserve"> on Stable Diffusion is evaluated on a test set consisting of both real indoor data and images generated by Stable Diffusion. In addition, we constructed an additional general test set for a more comprehensive evaluation, which includes images from all generative models as well as images from the indoor dataset, providing a complementary assessment. This testing strategy enables precise evaluation of the model’s performance on real data while also measuring its alignment with the broader synthetic domain.</w:t>
       </w:r>
     </w:p>
     <w:p>
@@ -1909,6 +1943,14 @@
         </w:rPr>
         <w:lastRenderedPageBreak/>
         <w:t>Result</w:t>
+      </w:r>
+      <w:r>
+        <w:rPr>
+          <w:b/>
+          <w:bCs/>
+          <w:color w:val="auto"/>
+        </w:rPr>
+        <w:t xml:space="preserve"> </w:t>
       </w:r>
     </w:p>
     <w:p>
@@ -3056,12 +3098,49 @@
         </w:rPr>
         <w:t xml:space="preserve">Table </w:t>
       </w:r>
+      <w:proofErr w:type="gramStart"/>
       <w:r>
         <w:rPr>
           <w:sz w:val="18"/>
           <w:szCs w:val="18"/>
         </w:rPr>
         <w:t>1</w:t>
+      </w:r>
+      <w:r>
+        <w:rPr>
+          <w:sz w:val="18"/>
+          <w:szCs w:val="18"/>
+        </w:rPr>
+        <w:t xml:space="preserve"> :</w:t>
+      </w:r>
+      <w:proofErr w:type="gramEnd"/>
+      <w:r>
+        <w:rPr>
+          <w:sz w:val="18"/>
+          <w:szCs w:val="18"/>
+        </w:rPr>
+        <w:t xml:space="preserve"> </w:t>
+      </w:r>
+      <w:r>
+        <w:rPr>
+          <w:sz w:val="18"/>
+          <w:szCs w:val="18"/>
+        </w:rPr>
+        <w:t xml:space="preserve">Evaluation of </w:t>
+      </w:r>
+      <w:r>
+        <w:rPr>
+          <w:sz w:val="18"/>
+          <w:szCs w:val="18"/>
+        </w:rPr>
+        <w:t xml:space="preserve">text-to-text </w:t>
+      </w:r>
+      <w:r>
+        <w:rPr>
+          <w:sz w:val="18"/>
+          <w:szCs w:val="18"/>
+        </w:rPr>
+        <w:t>models</w:t>
       </w:r>
     </w:p>
     <w:p>
@@ -3102,7 +3181,7 @@
           <w14:ligatures w14:val="none"/>
         </w:rPr>
         <w:drawing>
-          <wp:anchor distT="0" distB="0" distL="114300" distR="114300" simplePos="0" relativeHeight="251636736" behindDoc="0" locked="0" layoutInCell="1" allowOverlap="1" wp14:anchorId="0A066F0F" wp14:editId="301C5B90">
+          <wp:anchor distT="0" distB="0" distL="114300" distR="114300" simplePos="0" relativeHeight="251633664" behindDoc="0" locked="0" layoutInCell="1" allowOverlap="1" wp14:anchorId="0A066F0F" wp14:editId="27A4371E">
             <wp:simplePos x="0" y="0"/>
             <wp:positionH relativeFrom="column">
               <wp:posOffset>1196340</wp:posOffset>
@@ -3127,7 +3206,7 @@
                     </pic:cNvPicPr>
                   </pic:nvPicPr>
                   <pic:blipFill>
-                    <a:blip r:embed="rId11" cstate="print">
+                    <a:blip r:embed="rId12" cstate="print">
                       <a:extLst>
                         <a:ext uri="{28A0092B-C50C-407E-A947-70E740481C1C}">
                           <a14:useLocalDpi xmlns:a14="http://schemas.microsoft.com/office/drawing/2010/main" val="0"/>
@@ -3245,7 +3324,7 @@
           <w14:ligatures w14:val="none"/>
         </w:rPr>
         <w:drawing>
-          <wp:anchor distT="0" distB="0" distL="114300" distR="114300" simplePos="0" relativeHeight="251668480" behindDoc="0" locked="0" layoutInCell="1" allowOverlap="1" wp14:anchorId="1D58B8DC" wp14:editId="653F1C75">
+          <wp:anchor distT="0" distB="0" distL="114300" distR="114300" simplePos="0" relativeHeight="251665408" behindDoc="0" locked="0" layoutInCell="1" allowOverlap="1" wp14:anchorId="1D58B8DC" wp14:editId="0BCF5C1F">
             <wp:simplePos x="0" y="0"/>
             <wp:positionH relativeFrom="page">
               <wp:posOffset>1311910</wp:posOffset>
@@ -3270,7 +3349,7 @@
                     </pic:cNvPicPr>
                   </pic:nvPicPr>
                   <pic:blipFill>
-                    <a:blip r:embed="rId12" cstate="print">
+                    <a:blip r:embed="rId13" cstate="print">
                       <a:extLst>
                         <a:ext uri="{28A0092B-C50C-407E-A947-70E740481C1C}">
                           <a14:useLocalDpi xmlns:a14="http://schemas.microsoft.com/office/drawing/2010/main" val="0"/>
@@ -3322,7 +3401,7 @@
           <w:noProof/>
         </w:rPr>
         <w:drawing>
-          <wp:anchor distT="0" distB="0" distL="114300" distR="114300" simplePos="0" relativeHeight="251656192" behindDoc="0" locked="0" layoutInCell="1" allowOverlap="1" wp14:anchorId="06960A91" wp14:editId="4AF17FC6">
+          <wp:anchor distT="0" distB="0" distL="114300" distR="114300" simplePos="0" relativeHeight="251653120" behindDoc="0" locked="0" layoutInCell="1" allowOverlap="1" wp14:anchorId="06960A91" wp14:editId="61E34427">
             <wp:simplePos x="0" y="0"/>
             <wp:positionH relativeFrom="column">
               <wp:posOffset>-99060</wp:posOffset>
@@ -3347,7 +3426,7 @@
                     </pic:cNvPicPr>
                   </pic:nvPicPr>
                   <pic:blipFill>
-                    <a:blip r:embed="rId13" cstate="print">
+                    <a:blip r:embed="rId14" cstate="print">
                       <a:extLst>
                         <a:ext uri="{28A0092B-C50C-407E-A947-70E740481C1C}">
                           <a14:useLocalDpi xmlns:a14="http://schemas.microsoft.com/office/drawing/2010/main" val="0"/>
@@ -4174,7 +4253,49 @@
           <w:sz w:val="18"/>
           <w:szCs w:val="18"/>
         </w:rPr>
-        <w:t>Table 2</w:t>
+        <w:t xml:space="preserve">Table </w:t>
+      </w:r>
+      <w:r>
+        <w:rPr>
+          <w:sz w:val="18"/>
+          <w:szCs w:val="18"/>
+        </w:rPr>
+        <w:t>2:</w:t>
+      </w:r>
+      <w:r>
+        <w:rPr>
+          <w:sz w:val="18"/>
+          <w:szCs w:val="18"/>
+        </w:rPr>
+        <w:t xml:space="preserve"> </w:t>
+      </w:r>
+      <w:r>
+        <w:rPr>
+          <w:sz w:val="18"/>
+          <w:szCs w:val="18"/>
+        </w:rPr>
+        <w:t xml:space="preserve">Evaluation of </w:t>
+      </w:r>
+      <w:r>
+        <w:rPr>
+          <w:sz w:val="18"/>
+          <w:szCs w:val="18"/>
+        </w:rPr>
+        <w:t>image-to-image</w:t>
+      </w:r>
+      <w:r>
+        <w:rPr>
+          <w:sz w:val="18"/>
+          <w:szCs w:val="18"/>
+        </w:rPr>
+        <w:t xml:space="preserve"> </w:t>
+      </w:r>
+      <w:r>
+        <w:rPr>
+          <w:sz w:val="18"/>
+          <w:szCs w:val="18"/>
+        </w:rPr>
+        <w:t>models</w:t>
       </w:r>
     </w:p>
     <w:p>
@@ -4232,7 +4353,7 @@
                     </pic:cNvPicPr>
                   </pic:nvPicPr>
                   <pic:blipFill>
-                    <a:blip r:embed="rId14" cstate="print">
+                    <a:blip r:embed="rId15" cstate="print">
                       <a:extLst>
                         <a:ext uri="{28A0092B-C50C-407E-A947-70E740481C1C}">
                           <a14:useLocalDpi xmlns:a14="http://schemas.microsoft.com/office/drawing/2010/main" val="0"/>
@@ -4273,7 +4394,7 @@
           <w:noProof/>
         </w:rPr>
         <w:drawing>
-          <wp:anchor distT="0" distB="0" distL="114300" distR="114300" simplePos="0" relativeHeight="251666432" behindDoc="0" locked="0" layoutInCell="1" allowOverlap="1" wp14:anchorId="1E120B71" wp14:editId="2DBFAE51">
+          <wp:anchor distT="0" distB="0" distL="114300" distR="114300" simplePos="0" relativeHeight="251663360" behindDoc="0" locked="0" layoutInCell="1" allowOverlap="1" wp14:anchorId="1E120B71" wp14:editId="66BA663B">
             <wp:simplePos x="0" y="0"/>
             <wp:positionH relativeFrom="margin">
               <wp:align>center</wp:align>
@@ -4298,7 +4419,7 @@
                     </pic:cNvPicPr>
                   </pic:nvPicPr>
                   <pic:blipFill>
-                    <a:blip r:embed="rId15" cstate="print">
+                    <a:blip r:embed="rId16" cstate="print">
                       <a:extLst>
                         <a:ext uri="{28A0092B-C50C-407E-A947-70E740481C1C}">
                           <a14:useLocalDpi xmlns:a14="http://schemas.microsoft.com/office/drawing/2010/main" val="0"/>
@@ -4783,7 +4904,35 @@
           <w:sz w:val="18"/>
           <w:szCs w:val="18"/>
         </w:rPr>
-        <w:t>3</w:t>
+        <w:t>3:</w:t>
+      </w:r>
+      <w:r>
+        <w:rPr>
+          <w:sz w:val="18"/>
+          <w:szCs w:val="18"/>
+        </w:rPr>
+        <w:t xml:space="preserve"> </w:t>
+      </w:r>
+      <w:r>
+        <w:rPr>
+          <w:sz w:val="18"/>
+          <w:szCs w:val="18"/>
+        </w:rPr>
+        <w:t xml:space="preserve">Evaluation of the </w:t>
+      </w:r>
+      <w:r>
+        <w:rPr>
+          <w:sz w:val="18"/>
+          <w:szCs w:val="18"/>
+        </w:rPr>
+        <w:t xml:space="preserve">inpainting </w:t>
+      </w:r>
+      <w:r>
+        <w:rPr>
+          <w:sz w:val="18"/>
+          <w:szCs w:val="18"/>
+        </w:rPr>
+        <w:t>model</w:t>
       </w:r>
     </w:p>
     <w:p>
@@ -4818,7 +4967,7 @@
           <w:noProof/>
         </w:rPr>
         <w:drawing>
-          <wp:anchor distT="0" distB="0" distL="114300" distR="114300" simplePos="0" relativeHeight="251667456" behindDoc="0" locked="0" layoutInCell="1" allowOverlap="1" wp14:anchorId="5D0259C8" wp14:editId="2D8F15AB">
+          <wp:anchor distT="0" distB="0" distL="114300" distR="114300" simplePos="0" relativeHeight="251664384" behindDoc="0" locked="0" layoutInCell="1" allowOverlap="1" wp14:anchorId="5D0259C8" wp14:editId="17F0CC03">
             <wp:simplePos x="0" y="0"/>
             <wp:positionH relativeFrom="margin">
               <wp:posOffset>-30480</wp:posOffset>
@@ -4843,7 +4992,7 @@
                     </pic:cNvPicPr>
                   </pic:nvPicPr>
                   <pic:blipFill>
-                    <a:blip r:embed="rId16" cstate="print">
+                    <a:blip r:embed="rId17" cstate="print">
                       <a:extLst>
                         <a:ext uri="{28A0092B-C50C-407E-A947-70E740481C1C}">
                           <a14:useLocalDpi xmlns:a14="http://schemas.microsoft.com/office/drawing/2010/main" val="0"/>
@@ -5077,15 +5226,16 @@
         <w:tblLook w:val="04A0" w:firstRow="1" w:lastRow="0" w:firstColumn="1" w:lastColumn="0" w:noHBand="0" w:noVBand="1"/>
       </w:tblPr>
       <w:tblGrid>
-        <w:gridCol w:w="1976"/>
-        <w:gridCol w:w="2375"/>
-        <w:gridCol w:w="2375"/>
-        <w:gridCol w:w="1570"/>
+        <w:gridCol w:w="1735"/>
+        <w:gridCol w:w="2012"/>
+        <w:gridCol w:w="2014"/>
+        <w:gridCol w:w="1172"/>
+        <w:gridCol w:w="1363"/>
       </w:tblGrid>
       <w:tr>
         <w:tc>
           <w:tcPr>
-            <w:tcW w:w="1976" w:type="dxa"/>
+            <w:tcW w:w="1735" w:type="dxa"/>
             <w:vAlign w:val="center"/>
           </w:tcPr>
           <w:p>
@@ -5106,7 +5256,7 @@
         </w:tc>
         <w:tc>
           <w:tcPr>
-            <w:tcW w:w="2375" w:type="dxa"/>
+            <w:tcW w:w="2012" w:type="dxa"/>
             <w:vAlign w:val="center"/>
           </w:tcPr>
           <w:p>
@@ -5127,7 +5277,7 @@
         </w:tc>
         <w:tc>
           <w:tcPr>
-            <w:tcW w:w="2375" w:type="dxa"/>
+            <w:tcW w:w="2014" w:type="dxa"/>
             <w:vAlign w:val="center"/>
           </w:tcPr>
           <w:p>
@@ -5148,7 +5298,58 @@
         </w:tc>
         <w:tc>
           <w:tcPr>
-            <w:tcW w:w="1570" w:type="dxa"/>
+            <w:tcW w:w="1172" w:type="dxa"/>
+          </w:tcPr>
+          <w:p>
+            <w:pPr>
+              <w:bidi w:val="0"/>
+              <w:jc w:val="center"/>
+              <w:rPr>
+                <w:rFonts w:cs="Arial"/>
+                <w:b/>
+                <w:bCs/>
+                <w:color w:val="000000"/>
+              </w:rPr>
+            </w:pPr>
+            <w:r>
+              <w:rPr>
+                <w:rFonts w:cs="Arial"/>
+                <w:b/>
+                <w:bCs/>
+                <w:color w:val="000000"/>
+              </w:rPr>
+              <w:t>F1-Score</w:t>
+            </w:r>
+          </w:p>
+        </w:tc>
+        <w:tc>
+          <w:tcPr>
+            <w:tcW w:w="1363" w:type="dxa"/>
+            <w:vAlign w:val="center"/>
+          </w:tcPr>
+          <w:p>
+            <w:pPr>
+              <w:bidi w:val="0"/>
+              <w:jc w:val="center"/>
+              <w:rPr>
+                <w:b/>
+                <w:bCs/>
+              </w:rPr>
+            </w:pPr>
+            <w:r>
+              <w:rPr>
+                <w:b/>
+                <w:bCs/>
+              </w:rPr>
+              <w:t>AUC</w:t>
+            </w:r>
+          </w:p>
+        </w:tc>
+      </w:tr>
+      <w:tr>
+        <w:tc>
+          <w:tcPr>
+            <w:tcW w:w="1735" w:type="dxa"/>
             <w:vAlign w:val="center"/>
           </w:tcPr>
           <w:p>
@@ -5159,19 +5360,15 @@
             <w:r>
               <w:rPr>
                 <w:rFonts w:cs="Arial"/>
-                <w:b/>
-                <w:bCs/>
                 <w:color w:val="000000"/>
               </w:rPr>
-              <w:t>F1-Score</w:t>
+              <w:t>LBFD Net - Inpainting Dataset</w:t>
             </w:r>
           </w:p>
         </w:tc>
-      </w:tr>
-      <w:tr>
         <w:tc>
           <w:tcPr>
-            <w:tcW w:w="1976" w:type="dxa"/>
+            <w:tcW w:w="2012" w:type="dxa"/>
             <w:vAlign w:val="center"/>
           </w:tcPr>
           <w:p>
@@ -5182,15 +5379,17 @@
             <w:r>
               <w:rPr>
                 <w:rFonts w:cs="Arial"/>
+                <w:b/>
+                <w:bCs/>
                 <w:color w:val="000000"/>
               </w:rPr>
-              <w:t>LBFD Net - Inpainting Dataset</w:t>
+              <w:t>0.9222</w:t>
             </w:r>
           </w:p>
         </w:tc>
         <w:tc>
           <w:tcPr>
-            <w:tcW w:w="2375" w:type="dxa"/>
+            <w:tcW w:w="2014" w:type="dxa"/>
             <w:vAlign w:val="center"/>
           </w:tcPr>
           <w:p>
@@ -5205,13 +5404,51 @@
                 <w:bCs/>
                 <w:color w:val="000000"/>
               </w:rPr>
-              <w:t>0.9222</w:t>
+              <w:t>0.9524</w:t>
             </w:r>
           </w:p>
         </w:tc>
         <w:tc>
           <w:tcPr>
-            <w:tcW w:w="2375" w:type="dxa"/>
+            <w:tcW w:w="1172" w:type="dxa"/>
+          </w:tcPr>
+          <w:p>
+            <w:pPr>
+              <w:bidi w:val="0"/>
+              <w:jc w:val="center"/>
+              <w:rPr>
+                <w:rFonts w:cs="Arial"/>
+                <w:b/>
+                <w:bCs/>
+                <w:color w:val="000000"/>
+              </w:rPr>
+            </w:pPr>
+          </w:p>
+          <w:p>
+            <w:pPr>
+              <w:bidi w:val="0"/>
+              <w:jc w:val="center"/>
+              <w:rPr>
+                <w:rFonts w:cs="Arial"/>
+                <w:b/>
+                <w:bCs/>
+                <w:color w:val="000000"/>
+              </w:rPr>
+            </w:pPr>
+            <w:r>
+              <w:rPr>
+                <w:rFonts w:cs="Arial"/>
+                <w:b/>
+                <w:bCs/>
+                <w:color w:val="000000"/>
+              </w:rPr>
+              <w:t>0.9195</w:t>
+            </w:r>
+          </w:p>
+        </w:tc>
+        <w:tc>
+          <w:tcPr>
+            <w:tcW w:w="1363" w:type="dxa"/>
             <w:vAlign w:val="center"/>
           </w:tcPr>
           <w:p>
@@ -5220,34 +5457,7 @@
               <w:jc w:val="center"/>
             </w:pPr>
             <w:r>
-              <w:rPr>
-                <w:rFonts w:cs="Arial"/>
-                <w:b/>
-                <w:bCs/>
-                <w:color w:val="000000"/>
-              </w:rPr>
-              <w:t>0.9524</w:t>
-            </w:r>
-          </w:p>
-        </w:tc>
-        <w:tc>
-          <w:tcPr>
-            <w:tcW w:w="1570" w:type="dxa"/>
-            <w:vAlign w:val="center"/>
-          </w:tcPr>
-          <w:p>
-            <w:pPr>
-              <w:bidi w:val="0"/>
-              <w:jc w:val="center"/>
-            </w:pPr>
-            <w:r>
-              <w:rPr>
-                <w:rFonts w:cs="Arial"/>
-                <w:b/>
-                <w:bCs/>
-                <w:color w:val="000000"/>
-              </w:rPr>
-              <w:t>0.9195</w:t>
+              <w:t>0.94</w:t>
             </w:r>
           </w:p>
         </w:tc>
@@ -5255,7 +5465,7 @@
       <w:tr>
         <w:tc>
           <w:tcPr>
-            <w:tcW w:w="1976" w:type="dxa"/>
+            <w:tcW w:w="1735" w:type="dxa"/>
             <w:vAlign w:val="center"/>
           </w:tcPr>
           <w:p>
@@ -5296,7 +5506,7 @@
         </w:tc>
         <w:tc>
           <w:tcPr>
-            <w:tcW w:w="2375" w:type="dxa"/>
+            <w:tcW w:w="2012" w:type="dxa"/>
             <w:vAlign w:val="center"/>
           </w:tcPr>
           <w:p>
@@ -5315,7 +5525,7 @@
         </w:tc>
         <w:tc>
           <w:tcPr>
-            <w:tcW w:w="2375" w:type="dxa"/>
+            <w:tcW w:w="2014" w:type="dxa"/>
             <w:vAlign w:val="center"/>
           </w:tcPr>
           <w:p>
@@ -5334,13 +5544,17 @@
         </w:tc>
         <w:tc>
           <w:tcPr>
-            <w:tcW w:w="1570" w:type="dxa"/>
+            <w:tcW w:w="1172" w:type="dxa"/>
             <w:vAlign w:val="center"/>
           </w:tcPr>
           <w:p>
             <w:pPr>
               <w:bidi w:val="0"/>
               <w:jc w:val="center"/>
+              <w:rPr>
+                <w:rFonts w:cs="Arial"/>
+                <w:color w:val="000000"/>
+              </w:rPr>
             </w:pPr>
             <w:r>
               <w:rPr>
@@ -5348,6 +5562,29 @@
                 <w:color w:val="000000"/>
               </w:rPr>
               <w:t>0.8776</w:t>
+            </w:r>
+          </w:p>
+        </w:tc>
+        <w:tc>
+          <w:tcPr>
+            <w:tcW w:w="1363" w:type="dxa"/>
+            <w:vAlign w:val="center"/>
+          </w:tcPr>
+          <w:p>
+            <w:pPr>
+              <w:bidi w:val="0"/>
+              <w:jc w:val="center"/>
+              <w:rPr>
+                <w:b/>
+                <w:bCs/>
+              </w:rPr>
+            </w:pPr>
+            <w:r>
+              <w:rPr>
+                <w:b/>
+                <w:bCs/>
+              </w:rPr>
+              <w:t>0.95</w:t>
             </w:r>
           </w:p>
         </w:tc>
@@ -5355,7 +5592,7 @@
       <w:tr>
         <w:tc>
           <w:tcPr>
-            <w:tcW w:w="1976" w:type="dxa"/>
+            <w:tcW w:w="1735" w:type="dxa"/>
             <w:vAlign w:val="center"/>
           </w:tcPr>
           <w:p>
@@ -5396,7 +5633,7 @@
         </w:tc>
         <w:tc>
           <w:tcPr>
-            <w:tcW w:w="2375" w:type="dxa"/>
+            <w:tcW w:w="2012" w:type="dxa"/>
             <w:vAlign w:val="center"/>
           </w:tcPr>
           <w:p>
@@ -5415,7 +5652,7 @@
         </w:tc>
         <w:tc>
           <w:tcPr>
-            <w:tcW w:w="2375" w:type="dxa"/>
+            <w:tcW w:w="2014" w:type="dxa"/>
             <w:vAlign w:val="center"/>
           </w:tcPr>
           <w:p>
@@ -5434,7 +5671,30 @@
         </w:tc>
         <w:tc>
           <w:tcPr>
-            <w:tcW w:w="1570" w:type="dxa"/>
+            <w:tcW w:w="1172" w:type="dxa"/>
+            <w:vAlign w:val="center"/>
+          </w:tcPr>
+          <w:p>
+            <w:pPr>
+              <w:bidi w:val="0"/>
+              <w:jc w:val="center"/>
+              <w:rPr>
+                <w:rFonts w:cs="Arial"/>
+                <w:color w:val="000000"/>
+              </w:rPr>
+            </w:pPr>
+            <w:r>
+              <w:rPr>
+                <w:rFonts w:cs="Arial"/>
+                <w:color w:val="000000"/>
+              </w:rPr>
+              <w:t>0.8222</w:t>
+            </w:r>
+          </w:p>
+        </w:tc>
+        <w:tc>
+          <w:tcPr>
+            <w:tcW w:w="1363" w:type="dxa"/>
             <w:vAlign w:val="center"/>
           </w:tcPr>
           <w:p>
@@ -5443,11 +5703,7 @@
               <w:jc w:val="center"/>
             </w:pPr>
             <w:r>
-              <w:rPr>
-                <w:rFonts w:cs="Arial"/>
-                <w:color w:val="000000"/>
-              </w:rPr>
-              <w:t>0.8222</w:t>
+              <w:t>0.91</w:t>
             </w:r>
           </w:p>
         </w:tc>
@@ -5455,7 +5711,7 @@
       <w:tr>
         <w:tc>
           <w:tcPr>
-            <w:tcW w:w="1976" w:type="dxa"/>
+            <w:tcW w:w="1735" w:type="dxa"/>
             <w:vAlign w:val="center"/>
           </w:tcPr>
           <w:p>
@@ -5496,7 +5752,7 @@
         </w:tc>
         <w:tc>
           <w:tcPr>
-            <w:tcW w:w="2375" w:type="dxa"/>
+            <w:tcW w:w="2012" w:type="dxa"/>
             <w:vAlign w:val="center"/>
           </w:tcPr>
           <w:p>
@@ -5515,7 +5771,7 @@
         </w:tc>
         <w:tc>
           <w:tcPr>
-            <w:tcW w:w="2375" w:type="dxa"/>
+            <w:tcW w:w="2014" w:type="dxa"/>
             <w:vAlign w:val="center"/>
           </w:tcPr>
           <w:p>
@@ -5534,7 +5790,30 @@
         </w:tc>
         <w:tc>
           <w:tcPr>
-            <w:tcW w:w="1570" w:type="dxa"/>
+            <w:tcW w:w="1172" w:type="dxa"/>
+            <w:vAlign w:val="center"/>
+          </w:tcPr>
+          <w:p>
+            <w:pPr>
+              <w:bidi w:val="0"/>
+              <w:jc w:val="center"/>
+              <w:rPr>
+                <w:rFonts w:cs="Arial"/>
+                <w:color w:val="000000"/>
+              </w:rPr>
+            </w:pPr>
+            <w:r>
+              <w:rPr>
+                <w:rFonts w:cs="Arial"/>
+                <w:color w:val="000000"/>
+              </w:rPr>
+              <w:t>0.7725</w:t>
+            </w:r>
+          </w:p>
+        </w:tc>
+        <w:tc>
+          <w:tcPr>
+            <w:tcW w:w="1363" w:type="dxa"/>
             <w:vAlign w:val="center"/>
           </w:tcPr>
           <w:p>
@@ -5543,11 +5822,7 @@
               <w:jc w:val="center"/>
             </w:pPr>
             <w:r>
-              <w:rPr>
-                <w:rFonts w:cs="Arial"/>
-                <w:color w:val="000000"/>
-              </w:rPr>
-              <w:t>0.7725</w:t>
+              <w:t>0.93</w:t>
             </w:r>
           </w:p>
         </w:tc>
@@ -5556,6 +5831,43 @@
     <w:p>
       <w:pPr>
         <w:bidi w:val="0"/>
+        <w:rPr>
+          <w:sz w:val="18"/>
+          <w:szCs w:val="18"/>
+        </w:rPr>
+      </w:pPr>
+      <w:r>
+        <w:rPr>
+          <w:sz w:val="18"/>
+          <w:szCs w:val="18"/>
+        </w:rPr>
+        <w:t xml:space="preserve">Table </w:t>
+      </w:r>
+      <w:r>
+        <w:rPr>
+          <w:sz w:val="18"/>
+          <w:szCs w:val="18"/>
+        </w:rPr>
+        <w:t>4:</w:t>
+      </w:r>
+      <w:r>
+        <w:rPr>
+          <w:sz w:val="18"/>
+          <w:szCs w:val="18"/>
+        </w:rPr>
+        <w:t xml:space="preserve"> </w:t>
+      </w:r>
+      <w:r>
+        <w:rPr>
+          <w:sz w:val="18"/>
+          <w:szCs w:val="18"/>
+        </w:rPr>
+        <w:t>Evaluation of the models using dedicated test sets</w:t>
+      </w:r>
+    </w:p>
+    <w:p>
+      <w:pPr>
+        <w:bidi w:val="0"/>
         <w:spacing w:before="100" w:beforeAutospacing="1" w:after="100" w:afterAutospacing="1" w:line="240" w:lineRule="auto"/>
         <w:rPr>
           <w:rFonts w:ascii="Times New Roman" w:eastAsia="Times New Roman" w:hAnsi="Times New Roman" w:cs="Times New Roman"/>
@@ -5565,17 +5877,6 @@
           <w14:ligatures w14:val="none"/>
         </w:rPr>
       </w:pPr>
-    </w:p>
-    <w:p>
-      <w:pPr>
-        <w:pStyle w:val="NormalWeb"/>
-        <w:bidi w:val="0"/>
-        <w:rPr>
-          <w:rFonts w:asciiTheme="minorHAnsi" w:hAnsiTheme="minorHAnsi"/>
-          <w:sz w:val="22"/>
-          <w:szCs w:val="22"/>
-        </w:rPr>
-      </w:pPr>
       <w:r>
         <w:rPr>
           <w:rFonts w:eastAsia="Times New Roman"/>
@@ -5585,16 +5886,16 @@
         <mc:AlternateContent>
           <mc:Choice Requires="wpg">
             <w:drawing>
-              <wp:anchor distT="0" distB="0" distL="114300" distR="114300" simplePos="0" relativeHeight="251675648" behindDoc="0" locked="0" layoutInCell="1" allowOverlap="1" wp14:anchorId="2B3B5DFC" wp14:editId="48D0C87E">
+              <wp:anchor distT="0" distB="0" distL="114300" distR="114300" simplePos="0" relativeHeight="251672576" behindDoc="0" locked="0" layoutInCell="1" allowOverlap="1" wp14:anchorId="2B3B5DFC" wp14:editId="02AEEA71">
                 <wp:simplePos x="0" y="0"/>
                 <wp:positionH relativeFrom="margin">
                   <wp:align>right</wp:align>
                 </wp:positionH>
                 <wp:positionV relativeFrom="paragraph">
-                  <wp:posOffset>5080</wp:posOffset>
+                  <wp:posOffset>194945</wp:posOffset>
                 </wp:positionV>
-                <wp:extent cx="2270760" cy="2667000"/>
-                <wp:effectExtent l="0" t="0" r="0" b="0"/>
+                <wp:extent cx="2125980" cy="2324100"/>
+                <wp:effectExtent l="0" t="0" r="7620" b="0"/>
                 <wp:wrapSquare wrapText="bothSides"/>
                 <wp:docPr id="530637805" name="קבוצה 4"/>
                 <wp:cNvGraphicFramePr/>
@@ -5605,7 +5906,7 @@
                       <wpg:grpSpPr>
                         <a:xfrm>
                           <a:off x="0" y="0"/>
-                          <a:ext cx="2270760" cy="2667000"/>
+                          <a:ext cx="2125980" cy="2324100"/>
                           <a:chOff x="0" y="0"/>
                           <a:chExt cx="2270760" cy="2667000"/>
                         </a:xfrm>
@@ -5618,7 +5919,7 @@
                           </pic:cNvPicPr>
                         </pic:nvPicPr>
                         <pic:blipFill>
-                          <a:blip r:embed="rId17" cstate="print">
+                          <a:blip r:embed="rId18" cstate="print">
                             <a:extLst>
                               <a:ext uri="{28A0092B-C50C-407E-A947-70E740481C1C}">
                                 <a14:useLocalDpi xmlns:a14="http://schemas.microsoft.com/office/drawing/2010/main" val="0"/>
@@ -5685,7 +5986,7 @@
                                   <w:rFonts w:cs="Arial"/>
                                   <w:color w:val="000000"/>
                                 </w:rPr>
-                                <w:t>–</w:t>
+                                <w:t>-</w:t>
                               </w:r>
                               <w:r>
                                 <w:rPr>
@@ -5715,12 +6016,18 @@
                     </wpg:wgp>
                   </a:graphicData>
                 </a:graphic>
+                <wp14:sizeRelH relativeFrom="margin">
+                  <wp14:pctWidth>0</wp14:pctWidth>
+                </wp14:sizeRelH>
+                <wp14:sizeRelV relativeFrom="margin">
+                  <wp14:pctHeight>0</wp14:pctHeight>
+                </wp14:sizeRelV>
               </wp:anchor>
             </w:drawing>
           </mc:Choice>
           <mc:Fallback>
             <w:pict>
-              <v:group w14:anchorId="2B3B5DFC" id="קבוצה 4" o:spid="_x0000_s1026" style="position:absolute;margin-left:127.6pt;margin-top:.4pt;width:178.8pt;height:210pt;z-index:251675648;mso-position-horizontal:right;mso-position-horizontal-relative:margin" coordsize="22707,26670" o:gfxdata="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">
+              <v:group w14:anchorId="2B3B5DFC" id="קבוצה 4" o:spid="_x0000_s1026" style="position:absolute;margin-left:116.2pt;margin-top:15.35pt;width:167.4pt;height:183pt;z-index:251672576;mso-position-horizontal:right;mso-position-horizontal-relative:margin;mso-width-relative:margin;mso-height-relative:margin" coordsize="22707,26670" o:gfxdata="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">
                 <v:shapetype id="_x0000_t75" coordsize="21600,21600" o:spt="75" o:preferrelative="t" path="m@4@5l@4@11@9@11@9@5xe" filled="f" stroked="f">
                   <v:stroke joinstyle="miter"/>
                   <v:formulas>
@@ -5740,14 +6047,14 @@
                   <v:path o:extrusionok="f" gradientshapeok="t" o:connecttype="rect"/>
                   <o:lock v:ext="edit" aspectratio="t"/>
                 </v:shapetype>
-                <v:shape id="תמונה 1" o:spid="_x0000_s1027" type="#_x0000_t75" style="position:absolute;width:22707;height:23120;visibility:visible;mso-wrap-style:square" o:gfxdata="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">
-                  <v:imagedata r:id="rId18" o:title=""/>
+                <v:shape id="תמונה 1" o:spid="_x0000_s1027" type="#_x0000_t75" style="position:absolute;width:22707;height:23120;visibility:visible;mso-wrap-style:square" o:gfxdata="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">
+                  <v:imagedata r:id="rId19" o:title=""/>
                 </v:shape>
                 <v:shapetype id="_x0000_t202" coordsize="21600,21600" o:spt="202" path="m,l,21600r21600,l21600,xe">
                   <v:stroke joinstyle="miter"/>
                   <v:path gradientshapeok="t" o:connecttype="rect"/>
                 </v:shapetype>
-                <v:shape id="תיבת טקסט 2" o:spid="_x0000_s1028" type="#_x0000_t202" style="position:absolute;left:1447;top:23622;width:20708;height:3048;flip:x;visibility:visible;mso-wrap-style:square;v-text-anchor:top" o:gfxdata="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" stroked="f">
+                <v:shape id="_x0000_s1028" type="#_x0000_t202" style="position:absolute;left:1447;top:23622;width:20708;height:3048;flip:x;visibility:visible;mso-wrap-style:square;v-text-anchor:top" o:gfxdata="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" stroked="f">
                   <v:textbox>
                     <w:txbxContent>
                       <w:p>
@@ -5766,7 +6073,7 @@
                             <w:rFonts w:cs="Arial"/>
                             <w:color w:val="000000"/>
                           </w:rPr>
-                          <w:t>–</w:t>
+                          <w:t>-</w:t>
                         </w:r>
                         <w:r>
                           <w:rPr>
@@ -5803,13 +6110,13 @@
         <mc:AlternateContent>
           <mc:Choice Requires="wpg">
             <w:drawing>
-              <wp:anchor distT="0" distB="0" distL="114300" distR="114300" simplePos="0" relativeHeight="251671552" behindDoc="0" locked="0" layoutInCell="1" allowOverlap="1" wp14:anchorId="4C5D3082" wp14:editId="14AA5D8D">
+              <wp:anchor distT="0" distB="0" distL="114300" distR="114300" simplePos="0" relativeHeight="251668480" behindDoc="0" locked="0" layoutInCell="1" allowOverlap="1" wp14:anchorId="4C5D3082" wp14:editId="2D0DBA40">
                 <wp:simplePos x="0" y="0"/>
                 <wp:positionH relativeFrom="margin">
                   <wp:align>left</wp:align>
                 </wp:positionH>
                 <wp:positionV relativeFrom="paragraph">
-                  <wp:posOffset>109220</wp:posOffset>
+                  <wp:posOffset>165100</wp:posOffset>
                 </wp:positionV>
                 <wp:extent cx="2192655" cy="2255520"/>
                 <wp:effectExtent l="0" t="0" r="0" b="0"/>
@@ -5836,7 +6143,7 @@
                           </pic:cNvPicPr>
                         </pic:nvPicPr>
                         <pic:blipFill>
-                          <a:blip r:embed="rId19" cstate="print">
+                          <a:blip r:embed="rId20" cstate="print">
                             <a:extLst>
                               <a:ext uri="{28A0092B-C50C-407E-A947-70E740481C1C}">
                                 <a14:useLocalDpi xmlns:a14="http://schemas.microsoft.com/office/drawing/2010/main" val="0"/>
@@ -5899,6 +6206,11 @@
                                 <w:t>LBFD Net - Inpainting Dataset</w:t>
                               </w:r>
                             </w:p>
+                            <w:p>
+                              <w:pPr>
+                                <w:bidi w:val="0"/>
+                              </w:pPr>
+                            </w:p>
                             <w:p/>
                           </w:txbxContent>
                         </wps:txbx>
@@ -5920,11 +6232,11 @@
           </mc:Choice>
           <mc:Fallback>
             <w:pict>
-              <v:group w14:anchorId="4C5D3082" id="קבוצה 3" o:spid="_x0000_s1029" style="position:absolute;margin-left:0;margin-top:8.6pt;width:172.65pt;height:177.6pt;z-index:251671552;mso-position-horizontal:left;mso-position-horizontal-relative:margin;mso-width-relative:margin;mso-height-relative:margin" coordsize="22840,26289" o:gfxdata="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">
+              <v:group w14:anchorId="4C5D3082" id="קבוצה 3" o:spid="_x0000_s1029" style="position:absolute;margin-left:0;margin-top:13pt;width:172.65pt;height:177.6pt;z-index:251668480;mso-position-horizontal:left;mso-position-horizontal-relative:margin;mso-width-relative:margin;mso-height-relative:margin" coordsize="22840,26289" o:gfxdata="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">
                 <v:shape id="תמונה 2" o:spid="_x0000_s1030" type="#_x0000_t75" style="position:absolute;width:22840;height:23253;visibility:visible;mso-wrap-style:square" o:gfxdata="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">
-                  <v:imagedata r:id="rId20" o:title=""/>
+                  <v:imagedata r:id="rId21" o:title=""/>
                 </v:shape>
-                <v:shape id="תיבת טקסט 2" o:spid="_x0000_s1031" type="#_x0000_t202" style="position:absolute;left:2133;top:23241;width:20707;height:3048;flip:x;visibility:visible;mso-wrap-style:square;v-text-anchor:top" o:gfxdata="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" stroked="f">
+                <v:shape id="_x0000_s1031" type="#_x0000_t202" style="position:absolute;left:2133;top:23241;width:20707;height:3048;flip:x;visibility:visible;mso-wrap-style:square;v-text-anchor:top" o:gfxdata="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" stroked="f">
                   <v:textbox>
                     <w:txbxContent>
                       <w:p>
@@ -5939,6 +6251,11 @@
                           <w:t>LBFD Net - Inpainting Dataset</w:t>
                         </w:r>
                       </w:p>
+                      <w:p>
+                        <w:pPr>
+                          <w:bidi w:val="0"/>
+                        </w:pPr>
+                      </w:p>
                       <w:p/>
                     </w:txbxContent>
                   </v:textbox>
@@ -5949,6 +6266,201 @@
           </mc:Fallback>
         </mc:AlternateContent>
       </w:r>
+    </w:p>
+    <w:p>
+      <w:pPr>
+        <w:pStyle w:val="NormalWeb"/>
+        <w:bidi w:val="0"/>
+        <w:rPr>
+          <w:rFonts w:asciiTheme="minorHAnsi" w:hAnsiTheme="minorHAnsi"/>
+          <w:sz w:val="22"/>
+          <w:szCs w:val="22"/>
+        </w:rPr>
+      </w:pPr>
+      <w:r>
+        <w:rPr>
+          <w:rFonts w:cstheme="minorBidi"/>
+          <w:noProof/>
+          <w:sz w:val="18"/>
+          <w:szCs w:val="18"/>
+          <w:rtl/>
+        </w:rPr>
+        <mc:AlternateContent>
+          <mc:Choice Requires="wps">
+            <w:drawing>
+              <wp:anchor distT="45720" distB="45720" distL="114300" distR="114300" simplePos="0" relativeHeight="251682816" behindDoc="0" locked="0" layoutInCell="1" allowOverlap="1" wp14:anchorId="530B1FDB" wp14:editId="00E44756">
+                <wp:simplePos x="0" y="0"/>
+                <wp:positionH relativeFrom="column">
+                  <wp:posOffset>38100</wp:posOffset>
+                </wp:positionH>
+                <wp:positionV relativeFrom="paragraph">
+                  <wp:posOffset>5008245</wp:posOffset>
+                </wp:positionV>
+                <wp:extent cx="3497580" cy="243840"/>
+                <wp:effectExtent l="0" t="0" r="0" b="3810"/>
+                <wp:wrapSquare wrapText="bothSides"/>
+                <wp:docPr id="217" name="תיבת טקסט 2"/>
+                <wp:cNvGraphicFramePr>
+                  <a:graphicFrameLocks xmlns:a="http://schemas.openxmlformats.org/drawingml/2006/main"/>
+                </wp:cNvGraphicFramePr>
+                <a:graphic xmlns:a="http://schemas.openxmlformats.org/drawingml/2006/main">
+                  <a:graphicData uri="http://schemas.microsoft.com/office/word/2010/wordprocessingShape">
+                    <wps:wsp>
+                      <wps:cNvSpPr txBox="1">
+                        <a:spLocks noChangeArrowheads="1"/>
+                      </wps:cNvSpPr>
+                      <wps:spPr bwMode="auto">
+                        <a:xfrm flipH="1">
+                          <a:off x="0" y="0"/>
+                          <a:ext cx="3497580" cy="243840"/>
+                        </a:xfrm>
+                        <a:prstGeom prst="rect">
+                          <a:avLst/>
+                        </a:prstGeom>
+                        <a:noFill/>
+                        <a:ln w="9525">
+                          <a:noFill/>
+                          <a:miter lim="800000"/>
+                          <a:headEnd/>
+                          <a:tailEnd/>
+                        </a:ln>
+                      </wps:spPr>
+                      <wps:txbx>
+                        <w:txbxContent>
+                          <w:p>
+                            <w:pPr>
+                              <w:bidi w:val="0"/>
+                              <w:rPr>
+                                <w:sz w:val="18"/>
+                                <w:szCs w:val="18"/>
+                              </w:rPr>
+                            </w:pPr>
+                            <w:r>
+                              <w:rPr>
+                                <w:sz w:val="18"/>
+                                <w:szCs w:val="18"/>
+                              </w:rPr>
+                              <w:t>Figure</w:t>
+                            </w:r>
+                            <w:r>
+                              <w:rPr>
+                                <w:sz w:val="18"/>
+                                <w:szCs w:val="18"/>
+                              </w:rPr>
+                              <w:t>s</w:t>
+                            </w:r>
+                            <w:r>
+                              <w:rPr>
+                                <w:sz w:val="18"/>
+                                <w:szCs w:val="18"/>
+                              </w:rPr>
+                              <w:t xml:space="preserve"> 1</w:t>
+                            </w:r>
+                            <w:r>
+                              <w:rPr>
+                                <w:sz w:val="18"/>
+                                <w:szCs w:val="18"/>
+                              </w:rPr>
+                              <w:t>6-</w:t>
+                            </w:r>
+                            <w:r>
+                              <w:rPr>
+                                <w:sz w:val="18"/>
+                                <w:szCs w:val="18"/>
+                              </w:rPr>
+                              <w:t>19:</w:t>
+                            </w:r>
+                            <w:r>
+                              <w:rPr>
+                                <w:sz w:val="18"/>
+                                <w:szCs w:val="18"/>
+                              </w:rPr>
+                              <w:t xml:space="preserve"> Evaluation of the models using dedicated test sets</w:t>
+                            </w:r>
+                          </w:p>
+                          <w:p/>
+                        </w:txbxContent>
+                      </wps:txbx>
+                      <wps:bodyPr rot="0" vert="horz" wrap="square" lIns="91440" tIns="45720" rIns="91440" bIns="45720" anchor="t" anchorCtr="0">
+                        <a:noAutofit/>
+                      </wps:bodyPr>
+                    </wps:wsp>
+                  </a:graphicData>
+                </a:graphic>
+                <wp14:sizeRelH relativeFrom="margin">
+                  <wp14:pctWidth>0</wp14:pctWidth>
+                </wp14:sizeRelH>
+                <wp14:sizeRelV relativeFrom="margin">
+                  <wp14:pctHeight>0</wp14:pctHeight>
+                </wp14:sizeRelV>
+              </wp:anchor>
+            </w:drawing>
+          </mc:Choice>
+          <mc:Fallback>
+            <w:pict>
+              <v:shape w14:anchorId="530B1FDB" id="תיבת טקסט 2" o:spid="_x0000_s1032" type="#_x0000_t202" style="position:absolute;margin-left:3pt;margin-top:394.35pt;width:275.4pt;height:19.2pt;flip:x;z-index:251682816;visibility:visible;mso-wrap-style:square;mso-width-percent:0;mso-height-percent:0;mso-wrap-distance-left:9pt;mso-wrap-distance-top:3.6pt;mso-wrap-distance-right:9pt;mso-wrap-distance-bottom:3.6pt;mso-position-horizontal:absolute;mso-position-horizontal-relative:text;mso-position-vertical:absolute;mso-position-vertical-relative:text;mso-width-percent:0;mso-height-percent:0;mso-width-relative:margin;mso-height-relative:margin;v-text-anchor:top" o:gfxdata="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" filled="f" stroked="f">
+                <v:textbox>
+                  <w:txbxContent>
+                    <w:p>
+                      <w:pPr>
+                        <w:bidi w:val="0"/>
+                        <w:rPr>
+                          <w:sz w:val="18"/>
+                          <w:szCs w:val="18"/>
+                        </w:rPr>
+                      </w:pPr>
+                      <w:r>
+                        <w:rPr>
+                          <w:sz w:val="18"/>
+                          <w:szCs w:val="18"/>
+                        </w:rPr>
+                        <w:t>Figure</w:t>
+                      </w:r>
+                      <w:r>
+                        <w:rPr>
+                          <w:sz w:val="18"/>
+                          <w:szCs w:val="18"/>
+                        </w:rPr>
+                        <w:t>s</w:t>
+                      </w:r>
+                      <w:r>
+                        <w:rPr>
+                          <w:sz w:val="18"/>
+                          <w:szCs w:val="18"/>
+                        </w:rPr>
+                        <w:t xml:space="preserve"> 1</w:t>
+                      </w:r>
+                      <w:r>
+                        <w:rPr>
+                          <w:sz w:val="18"/>
+                          <w:szCs w:val="18"/>
+                        </w:rPr>
+                        <w:t>6-</w:t>
+                      </w:r>
+                      <w:r>
+                        <w:rPr>
+                          <w:sz w:val="18"/>
+                          <w:szCs w:val="18"/>
+                        </w:rPr>
+                        <w:t>19:</w:t>
+                      </w:r>
+                      <w:r>
+                        <w:rPr>
+                          <w:sz w:val="18"/>
+                          <w:szCs w:val="18"/>
+                        </w:rPr>
+                        <w:t xml:space="preserve"> Evaluation of the models using dedicated test sets</w:t>
+                      </w:r>
+                    </w:p>
+                    <w:p/>
+                  </w:txbxContent>
+                </v:textbox>
+                <w10:wrap type="square"/>
+              </v:shape>
+            </w:pict>
+          </mc:Fallback>
+        </mc:AlternateContent>
+      </w:r>
       <w:r>
         <w:rPr>
           <w:rFonts w:eastAsia="Times New Roman"/>
@@ -5958,13 +6470,209 @@
         <mc:AlternateContent>
           <mc:Choice Requires="wpg">
             <w:drawing>
-              <wp:anchor distT="0" distB="0" distL="114300" distR="114300" simplePos="0" relativeHeight="251683840" behindDoc="0" locked="0" layoutInCell="1" allowOverlap="1" wp14:anchorId="2F26A9BE" wp14:editId="306E5B1E">
+              <wp:anchor distT="0" distB="0" distL="114300" distR="114300" simplePos="0" relativeHeight="251676672" behindDoc="0" locked="0" layoutInCell="1" allowOverlap="1" wp14:anchorId="4496D809" wp14:editId="0B64A594">
                 <wp:simplePos x="0" y="0"/>
                 <wp:positionH relativeFrom="column">
-                  <wp:posOffset>3337560</wp:posOffset>
+                  <wp:posOffset>137160</wp:posOffset>
                 </wp:positionH>
                 <wp:positionV relativeFrom="paragraph">
-                  <wp:posOffset>3083560</wp:posOffset>
+                  <wp:posOffset>2432685</wp:posOffset>
+                </wp:positionV>
+                <wp:extent cx="2055495" cy="2377440"/>
+                <wp:effectExtent l="0" t="0" r="1905" b="3810"/>
+                <wp:wrapNone/>
+                <wp:docPr id="151799" name="קבוצה 5"/>
+                <wp:cNvGraphicFramePr/>
+                <a:graphic xmlns:a="http://schemas.openxmlformats.org/drawingml/2006/main">
+                  <a:graphicData uri="http://schemas.microsoft.com/office/word/2010/wordprocessingGroup">
+                    <wpg:wgp>
+                      <wpg:cNvGrpSpPr/>
+                      <wpg:grpSpPr>
+                        <a:xfrm>
+                          <a:off x="0" y="0"/>
+                          <a:ext cx="2055495" cy="2377440"/>
+                          <a:chOff x="0" y="0"/>
+                          <a:chExt cx="2124075" cy="2522220"/>
+                        </a:xfrm>
+                      </wpg:grpSpPr>
+                      <pic:pic xmlns:pic="http://schemas.openxmlformats.org/drawingml/2006/picture">
+                        <pic:nvPicPr>
+                          <pic:cNvPr id="1919746469" name="תמונה 1"/>
+                          <pic:cNvPicPr>
+                            <a:picLocks noChangeAspect="1"/>
+                          </pic:cNvPicPr>
+                        </pic:nvPicPr>
+                        <pic:blipFill>
+                          <a:blip r:embed="rId22" cstate="print">
+                            <a:extLst>
+                              <a:ext uri="{28A0092B-C50C-407E-A947-70E740481C1C}">
+                                <a14:useLocalDpi xmlns:a14="http://schemas.microsoft.com/office/drawing/2010/main" val="0"/>
+                              </a:ext>
+                            </a:extLst>
+                          </a:blip>
+                          <a:srcRect/>
+                          <a:stretch>
+                            <a:fillRect/>
+                          </a:stretch>
+                        </pic:blipFill>
+                        <pic:spPr bwMode="auto">
+                          <a:xfrm>
+                            <a:off x="0" y="0"/>
+                            <a:ext cx="2095500" cy="2143760"/>
+                          </a:xfrm>
+                          <a:prstGeom prst="rect">
+                            <a:avLst/>
+                          </a:prstGeom>
+                          <a:noFill/>
+                          <a:ln>
+                            <a:noFill/>
+                          </a:ln>
+                        </pic:spPr>
+                      </pic:pic>
+                      <wps:wsp>
+                        <wps:cNvPr id="392093719" name="תיבת טקסט 2"/>
+                        <wps:cNvSpPr txBox="1">
+                          <a:spLocks noChangeArrowheads="1"/>
+                        </wps:cNvSpPr>
+                        <wps:spPr bwMode="auto">
+                          <a:xfrm flipH="1">
+                            <a:off x="53340" y="2217420"/>
+                            <a:ext cx="2070735" cy="304800"/>
+                          </a:xfrm>
+                          <a:prstGeom prst="rect">
+                            <a:avLst/>
+                          </a:prstGeom>
+                          <a:solidFill>
+                            <a:srgbClr val="FFFFFF"/>
+                          </a:solidFill>
+                          <a:ln w="9525">
+                            <a:noFill/>
+                            <a:miter lim="800000"/>
+                            <a:headEnd/>
+                            <a:tailEnd/>
+                          </a:ln>
+                        </wps:spPr>
+                        <wps:txbx>
+                          <w:txbxContent>
+                            <w:p>
+                              <w:pPr>
+                                <w:bidi w:val="0"/>
+                              </w:pPr>
+                              <w:r>
+                                <w:rPr>
+                                  <w:rFonts w:cs="Arial"/>
+                                  <w:color w:val="000000"/>
+                                </w:rPr>
+                                <w:t xml:space="preserve">LBFD Net </w:t>
+                              </w:r>
+                              <w:r>
+                                <w:rPr>
+                                  <w:rFonts w:cs="Arial"/>
+                                  <w:color w:val="000000"/>
+                                </w:rPr>
+                                <w:t>-</w:t>
+                              </w:r>
+                              <w:r>
+                                <w:rPr>
+                                  <w:rFonts w:cs="Arial"/>
+                                  <w:color w:val="000000"/>
+                                </w:rPr>
+                                <w:t xml:space="preserve"> </w:t>
+                              </w:r>
+                              <w:r>
+                                <w:rPr>
+                                  <w:rFonts w:cs="Arial"/>
+                                  <w:color w:val="000000"/>
+                                </w:rPr>
+                                <w:t>Nano Banana</w:t>
+                              </w:r>
+                            </w:p>
+                            <w:p/>
+                          </w:txbxContent>
+                        </wps:txbx>
+                        <wps:bodyPr rot="0" vert="horz" wrap="square" lIns="91440" tIns="45720" rIns="91440" bIns="45720" anchor="t" anchorCtr="0">
+                          <a:noAutofit/>
+                        </wps:bodyPr>
+                      </wps:wsp>
+                    </wpg:wgp>
+                  </a:graphicData>
+                </a:graphic>
+                <wp14:sizeRelH relativeFrom="margin">
+                  <wp14:pctWidth>0</wp14:pctWidth>
+                </wp14:sizeRelH>
+                <wp14:sizeRelV relativeFrom="margin">
+                  <wp14:pctHeight>0</wp14:pctHeight>
+                </wp14:sizeRelV>
+              </wp:anchor>
+            </w:drawing>
+          </mc:Choice>
+          <mc:Fallback>
+            <w:pict>
+              <v:group w14:anchorId="4496D809" id="קבוצה 5" o:spid="_x0000_s1033" style="position:absolute;margin-left:10.8pt;margin-top:191.55pt;width:161.85pt;height:187.2pt;z-index:251676672;mso-width-relative:margin;mso-height-relative:margin" coordsize="21240,25222" o:gfxdata="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">
+                <v:shape id="תמונה 1" o:spid="_x0000_s1034" type="#_x0000_t75" style="position:absolute;width:20955;height:21437;visibility:visible;mso-wrap-style:square" o:gfxdata="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">
+                  <v:imagedata r:id="rId23" o:title=""/>
+                </v:shape>
+                <v:shape id="_x0000_s1035" type="#_x0000_t202" style="position:absolute;left:533;top:22174;width:20707;height:3048;flip:x;visibility:visible;mso-wrap-style:square;v-text-anchor:top" o:gfxdata="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" stroked="f">
+                  <v:textbox>
+                    <w:txbxContent>
+                      <w:p>
+                        <w:pPr>
+                          <w:bidi w:val="0"/>
+                        </w:pPr>
+                        <w:r>
+                          <w:rPr>
+                            <w:rFonts w:cs="Arial"/>
+                            <w:color w:val="000000"/>
+                          </w:rPr>
+                          <w:t xml:space="preserve">LBFD Net </w:t>
+                        </w:r>
+                        <w:r>
+                          <w:rPr>
+                            <w:rFonts w:cs="Arial"/>
+                            <w:color w:val="000000"/>
+                          </w:rPr>
+                          <w:t>-</w:t>
+                        </w:r>
+                        <w:r>
+                          <w:rPr>
+                            <w:rFonts w:cs="Arial"/>
+                            <w:color w:val="000000"/>
+                          </w:rPr>
+                          <w:t xml:space="preserve"> </w:t>
+                        </w:r>
+                        <w:r>
+                          <w:rPr>
+                            <w:rFonts w:cs="Arial"/>
+                            <w:color w:val="000000"/>
+                          </w:rPr>
+                          <w:t>Nano Banana</w:t>
+                        </w:r>
+                      </w:p>
+                      <w:p/>
+                    </w:txbxContent>
+                  </v:textbox>
+                </v:shape>
+              </v:group>
+            </w:pict>
+          </mc:Fallback>
+        </mc:AlternateContent>
+      </w:r>
+      <w:r>
+        <w:rPr>
+          <w:rFonts w:eastAsia="Times New Roman"/>
+          <w:noProof/>
+          <w:kern w:val="0"/>
+        </w:rPr>
+        <mc:AlternateContent>
+          <mc:Choice Requires="wpg">
+            <w:drawing>
+              <wp:anchor distT="0" distB="0" distL="114300" distR="114300" simplePos="0" relativeHeight="251680768" behindDoc="0" locked="0" layoutInCell="1" allowOverlap="1" wp14:anchorId="2F26A9BE" wp14:editId="2F30DEE8">
+                <wp:simplePos x="0" y="0"/>
+                <wp:positionH relativeFrom="column">
+                  <wp:posOffset>3291840</wp:posOffset>
+                </wp:positionH>
+                <wp:positionV relativeFrom="paragraph">
+                  <wp:posOffset>2390140</wp:posOffset>
                 </wp:positionV>
                 <wp:extent cx="2146935" cy="2423160"/>
                 <wp:effectExtent l="0" t="0" r="5715" b="0"/>
@@ -5991,7 +6699,7 @@
                           </pic:cNvPicPr>
                         </pic:nvPicPr>
                         <pic:blipFill>
-                          <a:blip r:embed="rId21" cstate="print">
+                          <a:blip r:embed="rId24" cstate="print">
                             <a:extLst>
                               <a:ext uri="{28A0092B-C50C-407E-A947-70E740481C1C}">
                                 <a14:useLocalDpi xmlns:a14="http://schemas.microsoft.com/office/drawing/2010/main" val="0"/>
@@ -6058,7 +6766,7 @@
                                   <w:rFonts w:cs="Arial"/>
                                   <w:color w:val="000000"/>
                                 </w:rPr>
-                                <w:t>–</w:t>
+                                <w:t>-</w:t>
                               </w:r>
                               <w:r>
                                 <w:rPr>
@@ -6089,11 +6797,11 @@
           </mc:Choice>
           <mc:Fallback>
             <w:pict>
-              <v:group w14:anchorId="2F26A9BE" id="קבוצה 8" o:spid="_x0000_s1032" style="position:absolute;margin-left:262.8pt;margin-top:242.8pt;width:169.05pt;height:190.8pt;z-index:251683840;mso-width-relative:margin;mso-height-relative:margin" coordsize="22536,24993" o:gfxdata="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">
-                <v:shape id="תמונה 7" o:spid="_x0000_s1033" type="#_x0000_t75" style="position:absolute;width:20999;height:21482;visibility:visible;mso-wrap-style:square" o:gfxdata="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">
-                  <v:imagedata r:id="rId22" o:title=""/>
+              <v:group w14:anchorId="2F26A9BE" id="קבוצה 8" o:spid="_x0000_s1036" style="position:absolute;margin-left:259.2pt;margin-top:188.2pt;width:169.05pt;height:190.8pt;z-index:251680768;mso-width-relative:margin;mso-height-relative:margin" coordsize="22536,24993" o:gfxdata="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">
+                <v:shape id="תמונה 7" o:spid="_x0000_s1037" type="#_x0000_t75" style="position:absolute;width:20999;height:21482;visibility:visible;mso-wrap-style:square" o:gfxdata="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">
+                  <v:imagedata r:id="rId25" o:title=""/>
                 </v:shape>
-                <v:shape id="תיבת טקסט 2" o:spid="_x0000_s1034" type="#_x0000_t202" style="position:absolute;left:1828;top:21945;width:20708;height:3048;flip:x;visibility:visible;mso-wrap-style:square;v-text-anchor:top" o:gfxdata="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" stroked="f">
+                <v:shape id="_x0000_s1038" type="#_x0000_t202" style="position:absolute;left:1828;top:21945;width:20708;height:3048;flip:x;visibility:visible;mso-wrap-style:square;v-text-anchor:top" o:gfxdata="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" stroked="f">
                   <v:textbox>
                     <w:txbxContent>
                       <w:p>
@@ -6112,7 +6820,7 @@
                             <w:rFonts w:cs="Arial"/>
                             <w:color w:val="000000"/>
                           </w:rPr>
-                          <w:t>–</w:t>
+                          <w:t>-</w:t>
                         </w:r>
                         <w:r>
                           <w:rPr>
@@ -6133,25 +6841,656 @@
       </w:r>
       <w:r>
         <w:rPr>
-          <w:rFonts w:eastAsia="Times New Roman"/>
+          <w:rFonts w:asciiTheme="minorHAnsi" w:hAnsiTheme="minorHAnsi"/>
+          <w:sz w:val="22"/>
+          <w:szCs w:val="22"/>
+        </w:rPr>
+        <w:br w:type="page"/>
+      </w:r>
+    </w:p>
+    <w:p>
+      <w:pPr>
+        <w:pStyle w:val="4"/>
+        <w:bidi w:val="0"/>
+        <w:rPr>
+          <w:b/>
+          <w:bCs/>
+          <w:i w:val="0"/>
+          <w:iCs w:val="0"/>
+          <w:color w:val="auto"/>
+        </w:rPr>
+      </w:pPr>
+      <w:r>
+        <w:rPr>
+          <w:b/>
+          <w:bCs/>
+          <w:i w:val="0"/>
+          <w:iCs w:val="0"/>
+          <w:color w:val="auto"/>
+        </w:rPr>
+        <w:lastRenderedPageBreak/>
+        <w:t>Results Analysis</w:t>
+      </w:r>
+    </w:p>
+    <w:p>
+      <w:pPr>
+        <w:pStyle w:val="NormalWeb"/>
+        <w:bidi w:val="0"/>
+        <w:rPr>
+          <w:rFonts w:asciiTheme="minorHAnsi" w:eastAsia="Times New Roman" w:hAnsiTheme="minorHAnsi"/>
+          <w:kern w:val="0"/>
+          <w:sz w:val="22"/>
+          <w:szCs w:val="22"/>
+          <w14:ligatures w14:val="none"/>
+        </w:rPr>
+      </w:pPr>
+      <w:r>
+        <w:rPr>
+          <w:rFonts w:asciiTheme="minorHAnsi" w:eastAsia="Times New Roman" w:hAnsiTheme="minorHAnsi"/>
+          <w:kern w:val="0"/>
+          <w:sz w:val="22"/>
+          <w:szCs w:val="22"/>
+          <w14:ligatures w14:val="none"/>
+        </w:rPr>
+        <w:t>Fine-tuning on the inpainting-based dataset yielded the best overall performance, achieving the highest accuracy, precision, and F1-score, and demonstrating strong alignment with both indoor and outdoor fall patterns. The Stable Diffusion-based model attained the highest AUC, indicating superior class separability despite slightly lower accuracy. In contrast, the Nano Banana-based model exhibited consistently lower performance, reflecting limited generalization relative to the other generative approaches. Training on the combined datasets led to performance degradation, likely due to domain mismatch and increased heterogeneity.</w:t>
+      </w:r>
+    </w:p>
+    <w:p>
+      <w:pPr>
+        <w:pStyle w:val="4"/>
+        <w:bidi w:val="0"/>
+        <w:rPr>
+          <w:b/>
+          <w:bCs/>
+          <w:i w:val="0"/>
+          <w:iCs w:val="0"/>
+          <w:color w:val="auto"/>
+        </w:rPr>
+      </w:pPr>
+      <w:r>
+        <w:rPr>
+          <w:b/>
+          <w:bCs/>
+          <w:i w:val="0"/>
+          <w:iCs w:val="0"/>
+          <w:color w:val="auto"/>
+        </w:rPr>
+        <w:t>Quantitative Results</w:t>
+      </w:r>
+    </w:p>
+    <w:tbl>
+      <w:tblPr>
+        <w:tblStyle w:val="af3"/>
+        <w:tblpPr w:leftFromText="180" w:rightFromText="180" w:vertAnchor="text" w:horzAnchor="margin" w:tblpY="126"/>
+        <w:tblW w:w="0" w:type="auto"/>
+        <w:tblLook w:val="04A0" w:firstRow="1" w:lastRow="0" w:firstColumn="1" w:lastColumn="0" w:noHBand="0" w:noVBand="1"/>
+      </w:tblPr>
+      <w:tblGrid>
+        <w:gridCol w:w="1735"/>
+        <w:gridCol w:w="2012"/>
+        <w:gridCol w:w="2014"/>
+        <w:gridCol w:w="1172"/>
+        <w:gridCol w:w="1363"/>
+      </w:tblGrid>
+      <w:tr>
+        <w:tc>
+          <w:tcPr>
+            <w:tcW w:w="1735" w:type="dxa"/>
+            <w:vAlign w:val="center"/>
+          </w:tcPr>
+          <w:p>
+            <w:pPr>
+              <w:bidi w:val="0"/>
+              <w:jc w:val="center"/>
+            </w:pPr>
+            <w:r>
+              <w:rPr>
+                <w:rFonts w:cs="Arial"/>
+                <w:b/>
+                <w:bCs/>
+                <w:color w:val="000000"/>
+              </w:rPr>
+              <w:t>Models</w:t>
+            </w:r>
+          </w:p>
+        </w:tc>
+        <w:tc>
+          <w:tcPr>
+            <w:tcW w:w="2012" w:type="dxa"/>
+            <w:vAlign w:val="center"/>
+          </w:tcPr>
+          <w:p>
+            <w:pPr>
+              <w:bidi w:val="0"/>
+              <w:jc w:val="center"/>
+            </w:pPr>
+            <w:r>
+              <w:rPr>
+                <w:rFonts w:cs="Arial"/>
+                <w:b/>
+                <w:bCs/>
+                <w:color w:val="000000"/>
+              </w:rPr>
+              <w:t>Accuracy</w:t>
+            </w:r>
+          </w:p>
+        </w:tc>
+        <w:tc>
+          <w:tcPr>
+            <w:tcW w:w="2014" w:type="dxa"/>
+            <w:vAlign w:val="center"/>
+          </w:tcPr>
+          <w:p>
+            <w:pPr>
+              <w:bidi w:val="0"/>
+              <w:jc w:val="center"/>
+            </w:pPr>
+            <w:r>
+              <w:rPr>
+                <w:rFonts w:cs="Arial"/>
+                <w:b/>
+                <w:bCs/>
+                <w:color w:val="000000"/>
+              </w:rPr>
+              <w:t>Precision</w:t>
+            </w:r>
+          </w:p>
+        </w:tc>
+        <w:tc>
+          <w:tcPr>
+            <w:tcW w:w="1172" w:type="dxa"/>
+          </w:tcPr>
+          <w:p>
+            <w:pPr>
+              <w:bidi w:val="0"/>
+              <w:jc w:val="center"/>
+              <w:rPr>
+                <w:rFonts w:cs="Arial"/>
+                <w:b/>
+                <w:bCs/>
+                <w:color w:val="000000"/>
+              </w:rPr>
+            </w:pPr>
+            <w:r>
+              <w:rPr>
+                <w:rFonts w:cs="Arial"/>
+                <w:b/>
+                <w:bCs/>
+                <w:color w:val="000000"/>
+              </w:rPr>
+              <w:t>F1-Score</w:t>
+            </w:r>
+          </w:p>
+        </w:tc>
+        <w:tc>
+          <w:tcPr>
+            <w:tcW w:w="1363" w:type="dxa"/>
+            <w:vAlign w:val="center"/>
+          </w:tcPr>
+          <w:p>
+            <w:pPr>
+              <w:bidi w:val="0"/>
+              <w:jc w:val="center"/>
+              <w:rPr>
+                <w:b/>
+                <w:bCs/>
+              </w:rPr>
+            </w:pPr>
+            <w:r>
+              <w:rPr>
+                <w:b/>
+                <w:bCs/>
+              </w:rPr>
+              <w:t>AUC</w:t>
+            </w:r>
+          </w:p>
+        </w:tc>
+      </w:tr>
+      <w:tr>
+        <w:tc>
+          <w:tcPr>
+            <w:tcW w:w="1735" w:type="dxa"/>
+            <w:vAlign w:val="center"/>
+          </w:tcPr>
+          <w:p>
+            <w:pPr>
+              <w:bidi w:val="0"/>
+              <w:jc w:val="center"/>
+            </w:pPr>
+            <w:r>
+              <w:rPr>
+                <w:rFonts w:cs="Arial"/>
+                <w:color w:val="000000"/>
+              </w:rPr>
+              <w:t>LBFD Net - Inpainting Dataset</w:t>
+            </w:r>
+          </w:p>
+        </w:tc>
+        <w:tc>
+          <w:tcPr>
+            <w:tcW w:w="2012" w:type="dxa"/>
+            <w:vAlign w:val="center"/>
+          </w:tcPr>
+          <w:p>
+            <w:pPr>
+              <w:bidi w:val="0"/>
+              <w:jc w:val="center"/>
+            </w:pPr>
+            <w:r>
+              <w:rPr>
+                <w:rFonts w:cs="Arial"/>
+                <w:b/>
+                <w:bCs/>
+                <w:color w:val="000000"/>
+              </w:rPr>
+              <w:t>0.8593</w:t>
+            </w:r>
+          </w:p>
+        </w:tc>
+        <w:tc>
+          <w:tcPr>
+            <w:tcW w:w="2014" w:type="dxa"/>
+            <w:vAlign w:val="center"/>
+          </w:tcPr>
+          <w:p>
+            <w:pPr>
+              <w:bidi w:val="0"/>
+              <w:jc w:val="center"/>
+            </w:pPr>
+            <w:r>
+              <w:rPr>
+                <w:rFonts w:cs="Arial"/>
+                <w:b/>
+                <w:bCs/>
+                <w:color w:val="000000"/>
+              </w:rPr>
+              <w:t>0.8760</w:t>
+            </w:r>
+          </w:p>
+        </w:tc>
+        <w:tc>
+          <w:tcPr>
+            <w:tcW w:w="1172" w:type="dxa"/>
+          </w:tcPr>
+          <w:p>
+            <w:pPr>
+              <w:bidi w:val="0"/>
+              <w:jc w:val="center"/>
+              <w:rPr>
+                <w:rFonts w:cs="Arial"/>
+                <w:b/>
+                <w:bCs/>
+                <w:color w:val="000000"/>
+              </w:rPr>
+            </w:pPr>
+          </w:p>
+          <w:p>
+            <w:pPr>
+              <w:bidi w:val="0"/>
+              <w:jc w:val="center"/>
+              <w:rPr>
+                <w:rFonts w:cs="Arial"/>
+                <w:b/>
+                <w:bCs/>
+                <w:color w:val="000000"/>
+              </w:rPr>
+            </w:pPr>
+            <w:r>
+              <w:rPr>
+                <w:rFonts w:cs="Arial"/>
+                <w:b/>
+                <w:bCs/>
+                <w:color w:val="000000"/>
+              </w:rPr>
+              <w:t>0.8561</w:t>
+            </w:r>
+          </w:p>
+        </w:tc>
+        <w:tc>
+          <w:tcPr>
+            <w:tcW w:w="1363" w:type="dxa"/>
+            <w:vAlign w:val="center"/>
+          </w:tcPr>
+          <w:p>
+            <w:pPr>
+              <w:bidi w:val="0"/>
+              <w:jc w:val="center"/>
+              <w:rPr>
+                <w:b/>
+                <w:bCs/>
+              </w:rPr>
+            </w:pPr>
+            <w:r>
+              <w:rPr>
+                <w:b/>
+                <w:bCs/>
+              </w:rPr>
+              <w:t>0.91</w:t>
+            </w:r>
+          </w:p>
+        </w:tc>
+      </w:tr>
+      <w:tr>
+        <w:tc>
+          <w:tcPr>
+            <w:tcW w:w="1735" w:type="dxa"/>
+            <w:vAlign w:val="center"/>
+          </w:tcPr>
+          <w:p>
+            <w:pPr>
+              <w:pStyle w:val="NormalWeb"/>
+              <w:bidi w:val="0"/>
+              <w:jc w:val="center"/>
+              <w:rPr>
+                <w:rFonts w:asciiTheme="minorHAnsi" w:hAnsiTheme="minorHAnsi" w:cs="Arial"/>
+                <w:color w:val="000000"/>
+                <w:sz w:val="22"/>
+                <w:szCs w:val="22"/>
+              </w:rPr>
+            </w:pPr>
+            <w:r>
+              <w:rPr>
+                <w:rFonts w:asciiTheme="minorHAnsi" w:hAnsiTheme="minorHAnsi" w:cs="Arial"/>
+                <w:color w:val="000000"/>
+                <w:sz w:val="22"/>
+                <w:szCs w:val="22"/>
+              </w:rPr>
+              <w:t xml:space="preserve">LBFD Net - </w:t>
+            </w:r>
+          </w:p>
+          <w:p>
+            <w:pPr>
+              <w:bidi w:val="0"/>
+              <w:jc w:val="center"/>
+            </w:pPr>
+            <w:r>
+              <w:rPr>
+                <w:rFonts w:cs="Arial"/>
+                <w:color w:val="000000"/>
+              </w:rPr>
+              <w:t>Stable Diffusion Dataset</w:t>
+            </w:r>
+          </w:p>
+        </w:tc>
+        <w:tc>
+          <w:tcPr>
+            <w:tcW w:w="2012" w:type="dxa"/>
+            <w:vAlign w:val="center"/>
+          </w:tcPr>
+          <w:p>
+            <w:pPr>
+              <w:bidi w:val="0"/>
+              <w:jc w:val="center"/>
+            </w:pPr>
+            <w:r>
+              <w:rPr>
+                <w:rFonts w:cs="Arial"/>
+                <w:color w:val="000000"/>
+              </w:rPr>
+              <w:t>0.8111</w:t>
+            </w:r>
+          </w:p>
+        </w:tc>
+        <w:tc>
+          <w:tcPr>
+            <w:tcW w:w="2014" w:type="dxa"/>
+            <w:vAlign w:val="center"/>
+          </w:tcPr>
+          <w:p>
+            <w:pPr>
+              <w:bidi w:val="0"/>
+              <w:jc w:val="center"/>
+            </w:pPr>
+            <w:r>
+              <w:rPr>
+                <w:rFonts w:cs="Arial"/>
+                <w:color w:val="000000"/>
+              </w:rPr>
+              <w:t>0.7763</w:t>
+            </w:r>
+          </w:p>
+        </w:tc>
+        <w:tc>
+          <w:tcPr>
+            <w:tcW w:w="1172" w:type="dxa"/>
+            <w:vAlign w:val="center"/>
+          </w:tcPr>
+          <w:p>
+            <w:pPr>
+              <w:bidi w:val="0"/>
+              <w:jc w:val="center"/>
+              <w:rPr>
+                <w:rFonts w:cs="Arial"/>
+                <w:color w:val="000000"/>
+              </w:rPr>
+            </w:pPr>
+            <w:r>
+              <w:rPr>
+                <w:rFonts w:cs="Arial"/>
+                <w:color w:val="000000"/>
+              </w:rPr>
+              <w:t>0.8223</w:t>
+            </w:r>
+          </w:p>
+        </w:tc>
+        <w:tc>
+          <w:tcPr>
+            <w:tcW w:w="1363" w:type="dxa"/>
+            <w:vAlign w:val="center"/>
+          </w:tcPr>
+          <w:p>
+            <w:pPr>
+              <w:bidi w:val="0"/>
+              <w:jc w:val="center"/>
+            </w:pPr>
+            <w:r>
+              <w:t>0.87</w:t>
+            </w:r>
+          </w:p>
+        </w:tc>
+      </w:tr>
+      <w:tr>
+        <w:tc>
+          <w:tcPr>
+            <w:tcW w:w="1735" w:type="dxa"/>
+            <w:vAlign w:val="center"/>
+          </w:tcPr>
+          <w:p>
+            <w:pPr>
+              <w:pStyle w:val="NormalWeb"/>
+              <w:bidi w:val="0"/>
+              <w:jc w:val="center"/>
+              <w:rPr>
+                <w:rFonts w:asciiTheme="minorHAnsi" w:hAnsiTheme="minorHAnsi" w:cs="Arial"/>
+                <w:color w:val="000000"/>
+                <w:sz w:val="22"/>
+                <w:szCs w:val="22"/>
+              </w:rPr>
+            </w:pPr>
+            <w:r>
+              <w:rPr>
+                <w:rFonts w:asciiTheme="minorHAnsi" w:hAnsiTheme="minorHAnsi" w:cs="Arial"/>
+                <w:color w:val="000000"/>
+                <w:sz w:val="22"/>
+                <w:szCs w:val="22"/>
+              </w:rPr>
+              <w:t xml:space="preserve">LBFD-Net - </w:t>
+            </w:r>
+          </w:p>
+          <w:p>
+            <w:pPr>
+              <w:bidi w:val="0"/>
+              <w:jc w:val="center"/>
+            </w:pPr>
+            <w:r>
+              <w:rPr>
+                <w:rFonts w:cs="Arial"/>
+                <w:color w:val="000000"/>
+              </w:rPr>
+              <w:t>Nano Banana Dataset</w:t>
+            </w:r>
+          </w:p>
+        </w:tc>
+        <w:tc>
+          <w:tcPr>
+            <w:tcW w:w="2012" w:type="dxa"/>
+            <w:vAlign w:val="center"/>
+          </w:tcPr>
+          <w:p>
+            <w:pPr>
+              <w:bidi w:val="0"/>
+              <w:jc w:val="center"/>
+            </w:pPr>
+            <w:r>
+              <w:rPr>
+                <w:rFonts w:cs="Arial"/>
+                <w:color w:val="000000"/>
+              </w:rPr>
+              <w:t>0.8111</w:t>
+            </w:r>
+          </w:p>
+        </w:tc>
+        <w:tc>
+          <w:tcPr>
+            <w:tcW w:w="2014" w:type="dxa"/>
+            <w:vAlign w:val="center"/>
+          </w:tcPr>
+          <w:p>
+            <w:pPr>
+              <w:bidi w:val="0"/>
+              <w:jc w:val="center"/>
+            </w:pPr>
+            <w:r>
+              <w:rPr>
+                <w:rFonts w:cs="Arial"/>
+                <w:color w:val="000000"/>
+              </w:rPr>
+              <w:t>0.8088</w:t>
+            </w:r>
+          </w:p>
+        </w:tc>
+        <w:tc>
+          <w:tcPr>
+            <w:tcW w:w="1172" w:type="dxa"/>
+            <w:vAlign w:val="center"/>
+          </w:tcPr>
+          <w:p>
+            <w:pPr>
+              <w:bidi w:val="0"/>
+              <w:jc w:val="center"/>
+              <w:rPr>
+                <w:rFonts w:cs="Arial"/>
+                <w:color w:val="000000"/>
+              </w:rPr>
+            </w:pPr>
+            <w:r>
+              <w:rPr>
+                <w:rFonts w:cs="Arial"/>
+                <w:color w:val="000000"/>
+              </w:rPr>
+              <w:t>0.8118</w:t>
+            </w:r>
+          </w:p>
+        </w:tc>
+        <w:tc>
+          <w:tcPr>
+            <w:tcW w:w="1363" w:type="dxa"/>
+            <w:vAlign w:val="center"/>
+          </w:tcPr>
+          <w:p>
+            <w:pPr>
+              <w:bidi w:val="0"/>
+              <w:jc w:val="center"/>
+            </w:pPr>
+            <w:r>
+              <w:t>0.9</w:t>
+            </w:r>
+            <w:r>
+              <w:t>0</w:t>
+            </w:r>
+          </w:p>
+        </w:tc>
+      </w:tr>
+    </w:tbl>
+    <w:p>
+      <w:pPr>
+        <w:bidi w:val="0"/>
+        <w:rPr>
+          <w:sz w:val="18"/>
+          <w:szCs w:val="18"/>
+        </w:rPr>
+      </w:pPr>
+      <w:r>
+        <w:rPr>
+          <w:sz w:val="18"/>
+          <w:szCs w:val="18"/>
+        </w:rPr>
+        <w:t xml:space="preserve">Table </w:t>
+      </w:r>
+      <w:r>
+        <w:rPr>
+          <w:sz w:val="18"/>
+          <w:szCs w:val="18"/>
+        </w:rPr>
+        <w:t>5:</w:t>
+      </w:r>
+      <w:r>
+        <w:rPr>
+          <w:sz w:val="18"/>
+          <w:szCs w:val="18"/>
+        </w:rPr>
+        <w:t xml:space="preserve"> </w:t>
+      </w:r>
+      <w:r>
+        <w:rPr>
+          <w:sz w:val="18"/>
+          <w:szCs w:val="18"/>
+        </w:rPr>
+        <w:t xml:space="preserve">Evaluation of the models using </w:t>
+      </w:r>
+      <w:r>
+        <w:rPr>
+          <w:sz w:val="18"/>
+          <w:szCs w:val="18"/>
+        </w:rPr>
+        <w:t>general test set</w:t>
+      </w:r>
+    </w:p>
+    <w:p>
+      <w:pPr>
+        <w:pStyle w:val="NormalWeb"/>
+        <w:bidi w:val="0"/>
+        <w:rPr>
+          <w:rFonts w:asciiTheme="minorHAnsi" w:eastAsia="Times New Roman" w:hAnsiTheme="minorHAnsi"/>
+          <w:kern w:val="0"/>
+          <w:sz w:val="22"/>
+          <w:szCs w:val="22"/>
+          <w14:ligatures w14:val="none"/>
+        </w:rPr>
+      </w:pPr>
+      <w:r>
+        <w:rPr>
+          <w:rFonts w:asciiTheme="minorHAnsi" w:eastAsia="Times New Roman" w:hAnsiTheme="minorHAnsi"/>
           <w:noProof/>
           <w:kern w:val="0"/>
+          <w:sz w:val="22"/>
+          <w:szCs w:val="22"/>
         </w:rPr>
         <mc:AlternateContent>
           <mc:Choice Requires="wpg">
             <w:drawing>
-              <wp:anchor distT="0" distB="0" distL="114300" distR="114300" simplePos="0" relativeHeight="251679744" behindDoc="0" locked="0" layoutInCell="1" allowOverlap="1" wp14:anchorId="4496D809" wp14:editId="1B664384">
+              <wp:anchor distT="0" distB="0" distL="114300" distR="114300" simplePos="0" relativeHeight="251691008" behindDoc="0" locked="0" layoutInCell="1" allowOverlap="1" wp14:anchorId="36482303" wp14:editId="0156BA31">
                 <wp:simplePos x="0" y="0"/>
-                <wp:positionH relativeFrom="column">
-                  <wp:posOffset>137160</wp:posOffset>
+                <wp:positionH relativeFrom="margin">
+                  <wp:posOffset>3413760</wp:posOffset>
                 </wp:positionH>
                 <wp:positionV relativeFrom="paragraph">
-                  <wp:posOffset>3068320</wp:posOffset>
+                  <wp:posOffset>52705</wp:posOffset>
                 </wp:positionV>
-                <wp:extent cx="2124075" cy="2522220"/>
-                <wp:effectExtent l="0" t="0" r="9525" b="0"/>
+                <wp:extent cx="2182495" cy="2446020"/>
+                <wp:effectExtent l="0" t="0" r="8255" b="0"/>
                 <wp:wrapNone/>
-                <wp:docPr id="151799" name="קבוצה 5"/>
+                <wp:docPr id="770979203" name="קבוצה 7"/>
                 <wp:cNvGraphicFramePr/>
                 <a:graphic xmlns:a="http://schemas.openxmlformats.org/drawingml/2006/main">
                   <a:graphicData uri="http://schemas.microsoft.com/office/word/2010/wordprocessingGroup">
@@ -6160,54 +7499,49 @@
                       <wpg:grpSpPr>
                         <a:xfrm>
                           <a:off x="0" y="0"/>
-                          <a:ext cx="2124075" cy="2522220"/>
+                          <a:ext cx="2182495" cy="2446020"/>
                           <a:chOff x="0" y="0"/>
-                          <a:chExt cx="2124075" cy="2522220"/>
+                          <a:chExt cx="2144448" cy="2361113"/>
                         </a:xfrm>
                       </wpg:grpSpPr>
                       <pic:pic xmlns:pic="http://schemas.openxmlformats.org/drawingml/2006/picture">
                         <pic:nvPicPr>
-                          <pic:cNvPr id="1919746469" name="תמונה 1"/>
+                          <pic:cNvPr id="1487829266" name="תמונה 1"/>
                           <pic:cNvPicPr>
                             <a:picLocks noChangeAspect="1"/>
                           </pic:cNvPicPr>
                         </pic:nvPicPr>
                         <pic:blipFill>
-                          <a:blip r:embed="rId23" cstate="print">
+                          <a:blip r:embed="rId26" cstate="print">
                             <a:extLst>
                               <a:ext uri="{28A0092B-C50C-407E-A947-70E740481C1C}">
                                 <a14:useLocalDpi xmlns:a14="http://schemas.microsoft.com/office/drawing/2010/main" val="0"/>
                               </a:ext>
                             </a:extLst>
                           </a:blip>
-                          <a:srcRect/>
                           <a:stretch>
                             <a:fillRect/>
                           </a:stretch>
                         </pic:blipFill>
-                        <pic:spPr bwMode="auto">
+                        <pic:spPr>
                           <a:xfrm>
                             <a:off x="0" y="0"/>
-                            <a:ext cx="2095500" cy="2143760"/>
+                            <a:ext cx="2065020" cy="2113280"/>
                           </a:xfrm>
                           <a:prstGeom prst="rect">
                             <a:avLst/>
                           </a:prstGeom>
-                          <a:noFill/>
-                          <a:ln>
-                            <a:noFill/>
-                          </a:ln>
                         </pic:spPr>
                       </pic:pic>
                       <wps:wsp>
-                        <wps:cNvPr id="392093719" name="תיבת טקסט 2"/>
+                        <wps:cNvPr id="515439404" name="תיבת טקסט 2"/>
                         <wps:cNvSpPr txBox="1">
                           <a:spLocks noChangeArrowheads="1"/>
                         </wps:cNvSpPr>
                         <wps:spPr bwMode="auto">
                           <a:xfrm flipH="1">
-                            <a:off x="53340" y="2217420"/>
-                            <a:ext cx="2070735" cy="304800"/>
+                            <a:off x="205740" y="2095502"/>
+                            <a:ext cx="1938708" cy="265611"/>
                           </a:xfrm>
                           <a:prstGeom prst="rect">
                             <a:avLst/>
@@ -6240,7 +7574,626 @@
                                   <w:rFonts w:cs="Arial"/>
                                   <w:color w:val="000000"/>
                                 </w:rPr>
-                                <w:t>–</w:t>
+                                <w:t>-</w:t>
+                              </w:r>
+                              <w:r>
+                                <w:rPr>
+                                  <w:rFonts w:cs="Arial"/>
+                                  <w:color w:val="000000"/>
+                                </w:rPr>
+                                <w:t xml:space="preserve"> </w:t>
+                              </w:r>
+                              <w:r>
+                                <w:rPr>
+                                  <w:rFonts w:cs="Arial"/>
+                                  <w:color w:val="000000"/>
+                                </w:rPr>
+                                <w:t>St</w:t>
+                              </w:r>
+                              <w:r>
+                                <w:t>able Diffusion</w:t>
+                              </w:r>
+                            </w:p>
+                            <w:p/>
+                          </w:txbxContent>
+                        </wps:txbx>
+                        <wps:bodyPr rot="0" vert="horz" wrap="square" lIns="91440" tIns="45720" rIns="91440" bIns="45720" anchor="t" anchorCtr="0">
+                          <a:noAutofit/>
+                        </wps:bodyPr>
+                      </wps:wsp>
+                    </wpg:wgp>
+                  </a:graphicData>
+                </a:graphic>
+                <wp14:sizeRelH relativeFrom="margin">
+                  <wp14:pctWidth>0</wp14:pctWidth>
+                </wp14:sizeRelH>
+                <wp14:sizeRelV relativeFrom="margin">
+                  <wp14:pctHeight>0</wp14:pctHeight>
+                </wp14:sizeRelV>
+              </wp:anchor>
+            </w:drawing>
+          </mc:Choice>
+          <mc:Fallback>
+            <w:pict>
+              <v:group w14:anchorId="36482303" id="קבוצה 7" o:spid="_x0000_s1039" style="position:absolute;margin-left:268.8pt;margin-top:4.15pt;width:171.85pt;height:192.6pt;z-index:251691008;mso-position-horizontal-relative:margin;mso-width-relative:margin;mso-height-relative:margin" coordsize="21444,23611" o:gfxdata="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">
+                <v:shape id="תמונה 1" o:spid="_x0000_s1040" type="#_x0000_t75" style="position:absolute;width:20650;height:21132;visibility:visible;mso-wrap-style:square" o:gfxdata="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">
+                  <v:imagedata r:id="rId27" o:title=""/>
+                </v:shape>
+                <v:shape id="_x0000_s1041" type="#_x0000_t202" style="position:absolute;left:2057;top:20955;width:19387;height:2656;flip:x;visibility:visible;mso-wrap-style:square;v-text-anchor:top" o:gfxdata="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" stroked="f">
+                  <v:textbox>
+                    <w:txbxContent>
+                      <w:p>
+                        <w:pPr>
+                          <w:bidi w:val="0"/>
+                        </w:pPr>
+                        <w:r>
+                          <w:rPr>
+                            <w:rFonts w:cs="Arial"/>
+                            <w:color w:val="000000"/>
+                          </w:rPr>
+                          <w:t xml:space="preserve">LBFD Net </w:t>
+                        </w:r>
+                        <w:r>
+                          <w:rPr>
+                            <w:rFonts w:cs="Arial"/>
+                            <w:color w:val="000000"/>
+                          </w:rPr>
+                          <w:t>-</w:t>
+                        </w:r>
+                        <w:r>
+                          <w:rPr>
+                            <w:rFonts w:cs="Arial"/>
+                            <w:color w:val="000000"/>
+                          </w:rPr>
+                          <w:t xml:space="preserve"> </w:t>
+                        </w:r>
+                        <w:r>
+                          <w:rPr>
+                            <w:rFonts w:cs="Arial"/>
+                            <w:color w:val="000000"/>
+                          </w:rPr>
+                          <w:t>St</w:t>
+                        </w:r>
+                        <w:r>
+                          <w:t>able Diffusion</w:t>
+                        </w:r>
+                      </w:p>
+                      <w:p/>
+                    </w:txbxContent>
+                  </v:textbox>
+                </v:shape>
+                <w10:wrap anchorx="margin"/>
+              </v:group>
+            </w:pict>
+          </mc:Fallback>
+        </mc:AlternateContent>
+      </w:r>
+      <w:r>
+        <w:rPr>
+          <w:rFonts w:asciiTheme="minorHAnsi" w:eastAsia="Times New Roman" w:hAnsiTheme="minorHAnsi"/>
+          <w:noProof/>
+          <w:kern w:val="0"/>
+          <w:sz w:val="22"/>
+          <w:szCs w:val="22"/>
+        </w:rPr>
+        <mc:AlternateContent>
+          <mc:Choice Requires="wpg">
+            <w:drawing>
+              <wp:anchor distT="0" distB="0" distL="114300" distR="114300" simplePos="0" relativeHeight="251686912" behindDoc="0" locked="0" layoutInCell="1" allowOverlap="1" wp14:anchorId="23C26EA5" wp14:editId="13560BCE">
+                <wp:simplePos x="0" y="0"/>
+                <wp:positionH relativeFrom="margin">
+                  <wp:align>left</wp:align>
+                </wp:positionH>
+                <wp:positionV relativeFrom="paragraph">
+                  <wp:posOffset>94615</wp:posOffset>
+                </wp:positionV>
+                <wp:extent cx="2125980" cy="2356631"/>
+                <wp:effectExtent l="0" t="0" r="7620" b="5715"/>
+                <wp:wrapNone/>
+                <wp:docPr id="1734923218" name="קבוצה 6"/>
+                <wp:cNvGraphicFramePr/>
+                <a:graphic xmlns:a="http://schemas.openxmlformats.org/drawingml/2006/main">
+                  <a:graphicData uri="http://schemas.microsoft.com/office/word/2010/wordprocessingGroup">
+                    <wpg:wgp>
+                      <wpg:cNvGrpSpPr/>
+                      <wpg:grpSpPr>
+                        <a:xfrm>
+                          <a:off x="0" y="0"/>
+                          <a:ext cx="2125980" cy="2356631"/>
+                          <a:chOff x="0" y="0"/>
+                          <a:chExt cx="2126269" cy="2357143"/>
+                        </a:xfrm>
+                      </wpg:grpSpPr>
+                      <pic:pic xmlns:pic="http://schemas.openxmlformats.org/drawingml/2006/picture">
+                        <pic:nvPicPr>
+                          <pic:cNvPr id="2066013065" name="תמונה 1"/>
+                          <pic:cNvPicPr>
+                            <a:picLocks noChangeAspect="1"/>
+                          </pic:cNvPicPr>
+                        </pic:nvPicPr>
+                        <pic:blipFill>
+                          <a:blip r:embed="rId28" cstate="print">
+                            <a:extLst>
+                              <a:ext uri="{28A0092B-C50C-407E-A947-70E740481C1C}">
+                                <a14:useLocalDpi xmlns:a14="http://schemas.microsoft.com/office/drawing/2010/main" val="0"/>
+                              </a:ext>
+                            </a:extLst>
+                          </a:blip>
+                          <a:stretch>
+                            <a:fillRect/>
+                          </a:stretch>
+                        </pic:blipFill>
+                        <pic:spPr>
+                          <a:xfrm>
+                            <a:off x="0" y="0"/>
+                            <a:ext cx="2087880" cy="2137410"/>
+                          </a:xfrm>
+                          <a:prstGeom prst="rect">
+                            <a:avLst/>
+                          </a:prstGeom>
+                        </pic:spPr>
+                      </pic:pic>
+                      <wps:wsp>
+                        <wps:cNvPr id="496237520" name="תיבת טקסט 2"/>
+                        <wps:cNvSpPr txBox="1">
+                          <a:spLocks noChangeArrowheads="1"/>
+                        </wps:cNvSpPr>
+                        <wps:spPr bwMode="auto">
+                          <a:xfrm flipH="1">
+                            <a:off x="138432" y="2095633"/>
+                            <a:ext cx="1987837" cy="261510"/>
+                          </a:xfrm>
+                          <a:prstGeom prst="rect">
+                            <a:avLst/>
+                          </a:prstGeom>
+                          <a:solidFill>
+                            <a:srgbClr val="FFFFFF"/>
+                          </a:solidFill>
+                          <a:ln w="9525">
+                            <a:noFill/>
+                            <a:miter lim="800000"/>
+                            <a:headEnd/>
+                            <a:tailEnd/>
+                          </a:ln>
+                        </wps:spPr>
+                        <wps:txbx>
+                          <w:txbxContent>
+                            <w:p>
+                              <w:pPr>
+                                <w:bidi w:val="0"/>
+                              </w:pPr>
+                              <w:r>
+                                <w:rPr>
+                                  <w:rFonts w:cs="Arial"/>
+                                  <w:color w:val="000000"/>
+                                </w:rPr>
+                                <w:t>LBFD Net - Inpainting Dataset</w:t>
+                              </w:r>
+                            </w:p>
+                            <w:p>
+                              <w:pPr>
+                                <w:bidi w:val="0"/>
+                              </w:pPr>
+                            </w:p>
+                            <w:p/>
+                          </w:txbxContent>
+                        </wps:txbx>
+                        <wps:bodyPr rot="0" vert="horz" wrap="square" lIns="91440" tIns="45720" rIns="91440" bIns="45720" anchor="t" anchorCtr="0">
+                          <a:noAutofit/>
+                        </wps:bodyPr>
+                      </wps:wsp>
+                    </wpg:wgp>
+                  </a:graphicData>
+                </a:graphic>
+                <wp14:sizeRelH relativeFrom="margin">
+                  <wp14:pctWidth>0</wp14:pctWidth>
+                </wp14:sizeRelH>
+                <wp14:sizeRelV relativeFrom="margin">
+                  <wp14:pctHeight>0</wp14:pctHeight>
+                </wp14:sizeRelV>
+              </wp:anchor>
+            </w:drawing>
+          </mc:Choice>
+          <mc:Fallback>
+            <w:pict>
+              <v:group w14:anchorId="23C26EA5" id="קבוצה 6" o:spid="_x0000_s1042" style="position:absolute;margin-left:0;margin-top:7.45pt;width:167.4pt;height:185.55pt;z-index:251686912;mso-position-horizontal:left;mso-position-horizontal-relative:margin;mso-width-relative:margin;mso-height-relative:margin" coordsize="21262,23571" o:gfxdata="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">
+                <v:shape id="תמונה 1" o:spid="_x0000_s1043" type="#_x0000_t75" style="position:absolute;width:20878;height:21374;visibility:visible;mso-wrap-style:square" o:gfxdata="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">
+                  <v:imagedata r:id="rId29" o:title=""/>
+                </v:shape>
+                <v:shape id="_x0000_s1044" type="#_x0000_t202" style="position:absolute;left:1384;top:20956;width:19878;height:2615;flip:x;visibility:visible;mso-wrap-style:square;v-text-anchor:top" o:gfxdata="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" stroked="f">
+                  <v:textbox>
+                    <w:txbxContent>
+                      <w:p>
+                        <w:pPr>
+                          <w:bidi w:val="0"/>
+                        </w:pPr>
+                        <w:r>
+                          <w:rPr>
+                            <w:rFonts w:cs="Arial"/>
+                            <w:color w:val="000000"/>
+                          </w:rPr>
+                          <w:t>LBFD Net - Inpainting Dataset</w:t>
+                        </w:r>
+                      </w:p>
+                      <w:p>
+                        <w:pPr>
+                          <w:bidi w:val="0"/>
+                        </w:pPr>
+                      </w:p>
+                      <w:p/>
+                    </w:txbxContent>
+                  </v:textbox>
+                </v:shape>
+                <w10:wrap anchorx="margin"/>
+              </v:group>
+            </w:pict>
+          </mc:Fallback>
+        </mc:AlternateContent>
+      </w:r>
+      <w:r>
+        <w:rPr>
+          <w:rFonts w:asciiTheme="minorHAnsi" w:eastAsia="Times New Roman" w:hAnsiTheme="minorHAnsi"/>
+          <w:kern w:val="0"/>
+          <w:sz w:val="22"/>
+          <w:szCs w:val="22"/>
+          <w14:ligatures w14:val="none"/>
+        </w:rPr>
+        <w:br/>
+      </w:r>
+      <w:r>
+        <w:rPr>
+          <w:rFonts w:asciiTheme="minorHAnsi" w:eastAsia="Times New Roman" w:hAnsiTheme="minorHAnsi"/>
+          <w:kern w:val="0"/>
+          <w:sz w:val="22"/>
+          <w:szCs w:val="22"/>
+          <w14:ligatures w14:val="none"/>
+        </w:rPr>
+        <w:br/>
+      </w:r>
+      <w:r>
+        <w:rPr>
+          <w:rFonts w:asciiTheme="minorHAnsi" w:eastAsia="Times New Roman" w:hAnsiTheme="minorHAnsi"/>
+          <w:kern w:val="0"/>
+          <w:sz w:val="22"/>
+          <w:szCs w:val="22"/>
+          <w14:ligatures w14:val="none"/>
+        </w:rPr>
+        <w:br/>
+      </w:r>
+      <w:r>
+        <w:rPr>
+          <w:rFonts w:asciiTheme="minorHAnsi" w:eastAsia="Times New Roman" w:hAnsiTheme="minorHAnsi"/>
+          <w:kern w:val="0"/>
+          <w:sz w:val="22"/>
+          <w:szCs w:val="22"/>
+          <w14:ligatures w14:val="none"/>
+        </w:rPr>
+        <w:br/>
+      </w:r>
+      <w:r>
+        <w:rPr>
+          <w:rFonts w:asciiTheme="minorHAnsi" w:eastAsia="Times New Roman" w:hAnsiTheme="minorHAnsi"/>
+          <w:kern w:val="0"/>
+          <w:sz w:val="22"/>
+          <w:szCs w:val="22"/>
+          <w14:ligatures w14:val="none"/>
+        </w:rPr>
+        <w:br/>
+      </w:r>
+      <w:r>
+        <w:rPr>
+          <w:rFonts w:asciiTheme="minorHAnsi" w:eastAsia="Times New Roman" w:hAnsiTheme="minorHAnsi"/>
+          <w:kern w:val="0"/>
+          <w:sz w:val="22"/>
+          <w:szCs w:val="22"/>
+          <w14:ligatures w14:val="none"/>
+        </w:rPr>
+        <w:br/>
+      </w:r>
+      <w:r>
+        <w:rPr>
+          <w:rFonts w:asciiTheme="minorHAnsi" w:eastAsia="Times New Roman" w:hAnsiTheme="minorHAnsi"/>
+          <w:kern w:val="0"/>
+          <w:sz w:val="22"/>
+          <w:szCs w:val="22"/>
+          <w14:ligatures w14:val="none"/>
+        </w:rPr>
+        <w:br/>
+      </w:r>
+      <w:r>
+        <w:rPr>
+          <w:rFonts w:asciiTheme="minorHAnsi" w:eastAsia="Times New Roman" w:hAnsiTheme="minorHAnsi"/>
+          <w:kern w:val="0"/>
+          <w:sz w:val="22"/>
+          <w:szCs w:val="22"/>
+          <w14:ligatures w14:val="none"/>
+        </w:rPr>
+        <w:br/>
+      </w:r>
+      <w:r>
+        <w:rPr>
+          <w:rFonts w:asciiTheme="minorHAnsi" w:eastAsia="Times New Roman" w:hAnsiTheme="minorHAnsi"/>
+          <w:kern w:val="0"/>
+          <w:sz w:val="22"/>
+          <w:szCs w:val="22"/>
+          <w14:ligatures w14:val="none"/>
+        </w:rPr>
+        <w:br/>
+      </w:r>
+      <w:r>
+        <w:rPr>
+          <w:rFonts w:asciiTheme="minorHAnsi" w:eastAsia="Times New Roman" w:hAnsiTheme="minorHAnsi"/>
+          <w:kern w:val="0"/>
+          <w:sz w:val="22"/>
+          <w:szCs w:val="22"/>
+          <w14:ligatures w14:val="none"/>
+        </w:rPr>
+        <w:br/>
+      </w:r>
+      <w:r>
+        <w:rPr>
+          <w:rFonts w:asciiTheme="minorHAnsi" w:eastAsia="Times New Roman" w:hAnsiTheme="minorHAnsi"/>
+          <w:kern w:val="0"/>
+          <w:sz w:val="22"/>
+          <w:szCs w:val="22"/>
+          <w14:ligatures w14:val="none"/>
+        </w:rPr>
+        <w:br/>
+      </w:r>
+      <w:r>
+        <w:rPr>
+          <w:rFonts w:asciiTheme="minorHAnsi" w:eastAsia="Times New Roman" w:hAnsiTheme="minorHAnsi"/>
+          <w:kern w:val="0"/>
+          <w:sz w:val="22"/>
+          <w:szCs w:val="22"/>
+          <w14:ligatures w14:val="none"/>
+        </w:rPr>
+        <w:br/>
+      </w:r>
+    </w:p>
+    <w:p>
+      <w:pPr>
+        <w:pStyle w:val="NormalWeb"/>
+        <w:bidi w:val="0"/>
+        <w:rPr>
+          <w:rFonts w:asciiTheme="minorHAnsi" w:eastAsia="Times New Roman" w:hAnsiTheme="minorHAnsi"/>
+          <w:kern w:val="0"/>
+          <w:sz w:val="22"/>
+          <w:szCs w:val="22"/>
+          <w14:ligatures w14:val="none"/>
+        </w:rPr>
+      </w:pPr>
+    </w:p>
+    <w:p>
+      <w:pPr>
+        <w:pStyle w:val="NormalWeb"/>
+        <w:bidi w:val="0"/>
+        <w:rPr>
+          <w:rFonts w:asciiTheme="minorHAnsi" w:eastAsia="Times New Roman" w:hAnsiTheme="minorHAnsi"/>
+          <w:kern w:val="0"/>
+          <w:sz w:val="22"/>
+          <w:szCs w:val="22"/>
+          <w14:ligatures w14:val="none"/>
+        </w:rPr>
+      </w:pPr>
+      <w:r>
+        <w:rPr>
+          <w:rFonts w:asciiTheme="minorHAnsi" w:eastAsia="Times New Roman" w:hAnsiTheme="minorHAnsi"/>
+          <w:kern w:val="0"/>
+          <w:sz w:val="22"/>
+          <w:szCs w:val="22"/>
+          <w14:ligatures w14:val="none"/>
+        </w:rPr>
+        <w:br/>
+      </w:r>
+      <w:r>
+        <w:rPr>
+          <w:rFonts w:asciiTheme="minorHAnsi" w:eastAsia="Times New Roman" w:hAnsiTheme="minorHAnsi"/>
+          <w:kern w:val="0"/>
+          <w:sz w:val="22"/>
+          <w:szCs w:val="22"/>
+          <w14:ligatures w14:val="none"/>
+        </w:rPr>
+        <w:br/>
+      </w:r>
+      <w:r>
+        <w:rPr>
+          <w:rFonts w:asciiTheme="minorHAnsi" w:eastAsia="Times New Roman" w:hAnsiTheme="minorHAnsi"/>
+          <w:kern w:val="0"/>
+          <w:sz w:val="22"/>
+          <w:szCs w:val="22"/>
+          <w14:ligatures w14:val="none"/>
+        </w:rPr>
+        <w:br/>
+      </w:r>
+      <w:r>
+        <w:rPr>
+          <w:rFonts w:asciiTheme="minorHAnsi" w:eastAsia="Times New Roman" w:hAnsiTheme="minorHAnsi"/>
+          <w:kern w:val="0"/>
+          <w:sz w:val="22"/>
+          <w:szCs w:val="22"/>
+          <w14:ligatures w14:val="none"/>
+        </w:rPr>
+        <w:br/>
+      </w:r>
+      <w:r>
+        <w:rPr>
+          <w:rFonts w:asciiTheme="minorHAnsi" w:eastAsia="Times New Roman" w:hAnsiTheme="minorHAnsi"/>
+          <w:kern w:val="0"/>
+          <w:sz w:val="22"/>
+          <w:szCs w:val="22"/>
+          <w14:ligatures w14:val="none"/>
+        </w:rPr>
+        <w:br/>
+      </w:r>
+      <w:r>
+        <w:rPr>
+          <w:rFonts w:asciiTheme="minorHAnsi" w:eastAsia="Times New Roman" w:hAnsiTheme="minorHAnsi"/>
+          <w:kern w:val="0"/>
+          <w:sz w:val="22"/>
+          <w:szCs w:val="22"/>
+          <w14:ligatures w14:val="none"/>
+        </w:rPr>
+        <w:br/>
+      </w:r>
+      <w:r>
+        <w:rPr>
+          <w:rFonts w:asciiTheme="minorHAnsi" w:eastAsia="Times New Roman" w:hAnsiTheme="minorHAnsi"/>
+          <w:kern w:val="0"/>
+          <w:sz w:val="22"/>
+          <w:szCs w:val="22"/>
+          <w14:ligatures w14:val="none"/>
+        </w:rPr>
+        <w:br/>
+      </w:r>
+      <w:r>
+        <w:rPr>
+          <w:rFonts w:asciiTheme="minorHAnsi" w:eastAsia="Times New Roman" w:hAnsiTheme="minorHAnsi"/>
+          <w:kern w:val="0"/>
+          <w:sz w:val="22"/>
+          <w:szCs w:val="22"/>
+          <w14:ligatures w14:val="none"/>
+        </w:rPr>
+        <w:br/>
+      </w:r>
+      <w:r>
+        <w:rPr>
+          <w:rFonts w:asciiTheme="minorHAnsi" w:eastAsia="Times New Roman" w:hAnsiTheme="minorHAnsi"/>
+          <w:kern w:val="0"/>
+          <w:sz w:val="22"/>
+          <w:szCs w:val="22"/>
+          <w14:ligatures w14:val="none"/>
+        </w:rPr>
+        <w:br/>
+      </w:r>
+      <w:r>
+        <w:rPr>
+          <w:rFonts w:asciiTheme="minorHAnsi" w:eastAsia="Times New Roman" w:hAnsiTheme="minorHAnsi"/>
+          <w:kern w:val="0"/>
+          <w:sz w:val="22"/>
+          <w:szCs w:val="22"/>
+          <w14:ligatures w14:val="none"/>
+        </w:rPr>
+        <w:br/>
+      </w:r>
+      <w:r>
+        <w:rPr>
+          <w:rFonts w:asciiTheme="minorHAnsi" w:eastAsia="Times New Roman" w:hAnsiTheme="minorHAnsi"/>
+          <w:kern w:val="0"/>
+          <w:sz w:val="22"/>
+          <w:szCs w:val="22"/>
+          <w14:ligatures w14:val="none"/>
+        </w:rPr>
+        <w:br/>
+      </w:r>
+      <w:r>
+        <w:rPr>
+          <w:rFonts w:asciiTheme="minorHAnsi" w:eastAsia="Times New Roman" w:hAnsiTheme="minorHAnsi"/>
+          <w:noProof/>
+          <w:kern w:val="0"/>
+          <w:sz w:val="22"/>
+          <w:szCs w:val="22"/>
+        </w:rPr>
+        <w:lastRenderedPageBreak/>
+        <mc:AlternateContent>
+          <mc:Choice Requires="wpg">
+            <w:drawing>
+              <wp:anchor distT="0" distB="0" distL="114300" distR="114300" simplePos="0" relativeHeight="251695104" behindDoc="0" locked="0" layoutInCell="1" allowOverlap="1" wp14:anchorId="51EA5E4C" wp14:editId="546E45D3">
+                <wp:simplePos x="0" y="0"/>
+                <wp:positionH relativeFrom="column">
+                  <wp:posOffset>99060</wp:posOffset>
+                </wp:positionH>
+                <wp:positionV relativeFrom="paragraph">
+                  <wp:posOffset>-266700</wp:posOffset>
+                </wp:positionV>
+                <wp:extent cx="2194377" cy="2321844"/>
+                <wp:effectExtent l="0" t="0" r="0" b="2540"/>
+                <wp:wrapNone/>
+                <wp:docPr id="325080474" name="קבוצה 9"/>
+                <wp:cNvGraphicFramePr/>
+                <a:graphic xmlns:a="http://schemas.openxmlformats.org/drawingml/2006/main">
+                  <a:graphicData uri="http://schemas.microsoft.com/office/word/2010/wordprocessingGroup">
+                    <wpg:wgp>
+                      <wpg:cNvGrpSpPr/>
+                      <wpg:grpSpPr>
+                        <a:xfrm>
+                          <a:off x="0" y="0"/>
+                          <a:ext cx="2194377" cy="2321844"/>
+                          <a:chOff x="0" y="0"/>
+                          <a:chExt cx="2194377" cy="2321844"/>
+                        </a:xfrm>
+                      </wpg:grpSpPr>
+                      <pic:pic xmlns:pic="http://schemas.openxmlformats.org/drawingml/2006/picture">
+                        <pic:nvPicPr>
+                          <pic:cNvPr id="1979101283" name="תמונה 1"/>
+                          <pic:cNvPicPr>
+                            <a:picLocks noChangeAspect="1"/>
+                          </pic:cNvPicPr>
+                        </pic:nvPicPr>
+                        <pic:blipFill>
+                          <a:blip r:embed="rId30" cstate="print">
+                            <a:extLst>
+                              <a:ext uri="{28A0092B-C50C-407E-A947-70E740481C1C}">
+                                <a14:useLocalDpi xmlns:a14="http://schemas.microsoft.com/office/drawing/2010/main" val="0"/>
+                              </a:ext>
+                            </a:extLst>
+                          </a:blip>
+                          <a:stretch>
+                            <a:fillRect/>
+                          </a:stretch>
+                        </pic:blipFill>
+                        <pic:spPr>
+                          <a:xfrm>
+                            <a:off x="0" y="0"/>
+                            <a:ext cx="1973580" cy="2020570"/>
+                          </a:xfrm>
+                          <a:prstGeom prst="rect">
+                            <a:avLst/>
+                          </a:prstGeom>
+                        </pic:spPr>
+                      </pic:pic>
+                      <wps:wsp>
+                        <wps:cNvPr id="929493987" name="תיבת טקסט 2"/>
+                        <wps:cNvSpPr txBox="1">
+                          <a:spLocks noChangeArrowheads="1"/>
+                        </wps:cNvSpPr>
+                        <wps:spPr bwMode="auto">
+                          <a:xfrm flipH="1">
+                            <a:off x="190500" y="2034540"/>
+                            <a:ext cx="2003877" cy="287304"/>
+                          </a:xfrm>
+                          <a:prstGeom prst="rect">
+                            <a:avLst/>
+                          </a:prstGeom>
+                          <a:solidFill>
+                            <a:srgbClr val="FFFFFF"/>
+                          </a:solidFill>
+                          <a:ln w="9525">
+                            <a:noFill/>
+                            <a:miter lim="800000"/>
+                            <a:headEnd/>
+                            <a:tailEnd/>
+                          </a:ln>
+                        </wps:spPr>
+                        <wps:txbx>
+                          <w:txbxContent>
+                            <w:p>
+                              <w:pPr>
+                                <w:bidi w:val="0"/>
+                              </w:pPr>
+                              <w:r>
+                                <w:rPr>
+                                  <w:rFonts w:cs="Arial"/>
+                                  <w:color w:val="000000"/>
+                                </w:rPr>
+                                <w:t xml:space="preserve">LBFD Net </w:t>
+                              </w:r>
+                              <w:r>
+                                <w:rPr>
+                                  <w:rFonts w:cs="Arial"/>
+                                  <w:color w:val="000000"/>
+                                </w:rPr>
+                                <w:t>-</w:t>
                               </w:r>
                               <w:r>
                                 <w:rPr>
@@ -6272,11 +8225,11 @@
           </mc:Choice>
           <mc:Fallback>
             <w:pict>
-              <v:group w14:anchorId="4496D809" id="קבוצה 5" o:spid="_x0000_s1035" style="position:absolute;margin-left:10.8pt;margin-top:241.6pt;width:167.25pt;height:198.6pt;z-index:251679744" coordsize="21240,25222" o:gfxdata="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">
-                <v:shape id="תמונה 1" o:spid="_x0000_s1036" type="#_x0000_t75" style="position:absolute;width:20955;height:21437;visibility:visible;mso-wrap-style:square" o:gfxdata="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">
-                  <v:imagedata r:id="rId24" o:title=""/>
+              <v:group w14:anchorId="51EA5E4C" id="קבוצה 9" o:spid="_x0000_s1045" style="position:absolute;margin-left:7.8pt;margin-top:-21pt;width:172.8pt;height:182.8pt;z-index:251695104" coordsize="21943,23218" o:gfxdata="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">
+                <v:shape id="תמונה 1" o:spid="_x0000_s1046" type="#_x0000_t75" style="position:absolute;width:19735;height:20205;visibility:visible;mso-wrap-style:square" o:gfxdata="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">
+                  <v:imagedata r:id="rId31" o:title=""/>
                 </v:shape>
-                <v:shape id="תיבת טקסט 2" o:spid="_x0000_s1037" type="#_x0000_t202" style="position:absolute;left:533;top:22174;width:20707;height:3048;flip:x;visibility:visible;mso-wrap-style:square;v-text-anchor:top" o:gfxdata="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" stroked="f">
+                <v:shape id="_x0000_s1047" type="#_x0000_t202" style="position:absolute;left:1905;top:20345;width:20038;height:2873;flip:x;visibility:visible;mso-wrap-style:square;v-text-anchor:top" o:gfxdata="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" stroked="f">
                   <v:textbox>
                     <w:txbxContent>
                       <w:p>
@@ -6295,7 +8248,7 @@
                             <w:rFonts w:cs="Arial"/>
                             <w:color w:val="000000"/>
                           </w:rPr>
-                          <w:t>–</w:t>
+                          <w:t>-</w:t>
                         </w:r>
                         <w:r>
                           <w:rPr>
@@ -6323,11 +8276,307 @@
       </w:r>
       <w:r>
         <w:rPr>
-          <w:rFonts w:asciiTheme="minorHAnsi" w:hAnsiTheme="minorHAnsi"/>
+          <w:rFonts w:asciiTheme="minorHAnsi" w:eastAsia="Times New Roman" w:hAnsiTheme="minorHAnsi"/>
+          <w:kern w:val="0"/>
           <w:sz w:val="22"/>
           <w:szCs w:val="22"/>
-        </w:rPr>
-        <w:br w:type="page"/>
+          <w14:ligatures w14:val="none"/>
+        </w:rPr>
+        <w:br/>
+      </w:r>
+      <w:r>
+        <w:rPr>
+          <w:rFonts w:asciiTheme="minorHAnsi" w:eastAsia="Times New Roman" w:hAnsiTheme="minorHAnsi"/>
+          <w:kern w:val="0"/>
+          <w:sz w:val="22"/>
+          <w:szCs w:val="22"/>
+          <w14:ligatures w14:val="none"/>
+        </w:rPr>
+        <w:br/>
+      </w:r>
+      <w:r>
+        <w:rPr>
+          <w:rFonts w:asciiTheme="minorHAnsi" w:eastAsia="Times New Roman" w:hAnsiTheme="minorHAnsi"/>
+          <w:kern w:val="0"/>
+          <w:sz w:val="22"/>
+          <w:szCs w:val="22"/>
+          <w14:ligatures w14:val="none"/>
+        </w:rPr>
+        <w:br/>
+      </w:r>
+      <w:r>
+        <w:rPr>
+          <w:rFonts w:asciiTheme="minorHAnsi" w:eastAsia="Times New Roman" w:hAnsiTheme="minorHAnsi"/>
+          <w:kern w:val="0"/>
+          <w:sz w:val="22"/>
+          <w:szCs w:val="22"/>
+          <w14:ligatures w14:val="none"/>
+        </w:rPr>
+        <w:br/>
+      </w:r>
+      <w:r>
+        <w:rPr>
+          <w:rFonts w:asciiTheme="minorHAnsi" w:eastAsia="Times New Roman" w:hAnsiTheme="minorHAnsi"/>
+          <w:kern w:val="0"/>
+          <w:sz w:val="22"/>
+          <w:szCs w:val="22"/>
+          <w14:ligatures w14:val="none"/>
+        </w:rPr>
+        <w:br/>
+      </w:r>
+      <w:r>
+        <w:rPr>
+          <w:rFonts w:asciiTheme="minorHAnsi" w:eastAsia="Times New Roman" w:hAnsiTheme="minorHAnsi"/>
+          <w:kern w:val="0"/>
+          <w:sz w:val="22"/>
+          <w:szCs w:val="22"/>
+          <w14:ligatures w14:val="none"/>
+        </w:rPr>
+        <w:br/>
+      </w:r>
+      <w:r>
+        <w:rPr>
+          <w:rFonts w:asciiTheme="minorHAnsi" w:eastAsia="Times New Roman" w:hAnsiTheme="minorHAnsi"/>
+          <w:kern w:val="0"/>
+          <w:sz w:val="22"/>
+          <w:szCs w:val="22"/>
+          <w14:ligatures w14:val="none"/>
+        </w:rPr>
+        <w:br/>
+      </w:r>
+      <w:r>
+        <w:rPr>
+          <w:rFonts w:asciiTheme="minorHAnsi" w:eastAsia="Times New Roman" w:hAnsiTheme="minorHAnsi"/>
+          <w:kern w:val="0"/>
+          <w:sz w:val="22"/>
+          <w:szCs w:val="22"/>
+          <w14:ligatures w14:val="none"/>
+        </w:rPr>
+        <w:br/>
+      </w:r>
+      <w:r>
+        <w:rPr>
+          <w:rFonts w:asciiTheme="minorHAnsi" w:eastAsia="Times New Roman" w:hAnsiTheme="minorHAnsi"/>
+          <w:kern w:val="0"/>
+          <w:sz w:val="22"/>
+          <w:szCs w:val="22"/>
+          <w14:ligatures w14:val="none"/>
+        </w:rPr>
+        <w:br/>
+      </w:r>
+      <w:r>
+        <w:rPr>
+          <w:rFonts w:asciiTheme="minorHAnsi" w:eastAsia="Times New Roman" w:hAnsiTheme="minorHAnsi"/>
+          <w:kern w:val="0"/>
+          <w:sz w:val="22"/>
+          <w:szCs w:val="22"/>
+          <w14:ligatures w14:val="none"/>
+        </w:rPr>
+        <w:br/>
+      </w:r>
+      <w:r>
+        <w:rPr>
+          <w:rFonts w:cstheme="minorBidi"/>
+          <w:noProof/>
+          <w:sz w:val="18"/>
+          <w:szCs w:val="18"/>
+          <w:rtl/>
+        </w:rPr>
+        <mc:AlternateContent>
+          <mc:Choice Requires="wps">
+            <w:drawing>
+              <wp:anchor distT="45720" distB="45720" distL="114300" distR="114300" simplePos="0" relativeHeight="251697152" behindDoc="0" locked="0" layoutInCell="1" allowOverlap="1" wp14:anchorId="753F0A17" wp14:editId="637A6F68">
+                <wp:simplePos x="0" y="0"/>
+                <wp:positionH relativeFrom="margin">
+                  <wp:align>left</wp:align>
+                </wp:positionH>
+                <wp:positionV relativeFrom="paragraph">
+                  <wp:posOffset>2010410</wp:posOffset>
+                </wp:positionV>
+                <wp:extent cx="3497580" cy="243840"/>
+                <wp:effectExtent l="0" t="0" r="0" b="3810"/>
+                <wp:wrapSquare wrapText="bothSides"/>
+                <wp:docPr id="1292658731" name="תיבת טקסט 2"/>
+                <wp:cNvGraphicFramePr>
+                  <a:graphicFrameLocks xmlns:a="http://schemas.openxmlformats.org/drawingml/2006/main"/>
+                </wp:cNvGraphicFramePr>
+                <a:graphic xmlns:a="http://schemas.openxmlformats.org/drawingml/2006/main">
+                  <a:graphicData uri="http://schemas.microsoft.com/office/word/2010/wordprocessingShape">
+                    <wps:wsp>
+                      <wps:cNvSpPr txBox="1">
+                        <a:spLocks noChangeArrowheads="1"/>
+                      </wps:cNvSpPr>
+                      <wps:spPr bwMode="auto">
+                        <a:xfrm flipH="1">
+                          <a:off x="0" y="0"/>
+                          <a:ext cx="3497580" cy="243840"/>
+                        </a:xfrm>
+                        <a:prstGeom prst="rect">
+                          <a:avLst/>
+                        </a:prstGeom>
+                        <a:noFill/>
+                        <a:ln w="9525">
+                          <a:noFill/>
+                          <a:miter lim="800000"/>
+                          <a:headEnd/>
+                          <a:tailEnd/>
+                        </a:ln>
+                      </wps:spPr>
+                      <wps:txbx>
+                        <w:txbxContent>
+                          <w:p>
+                            <w:pPr>
+                              <w:bidi w:val="0"/>
+                              <w:rPr>
+                                <w:sz w:val="18"/>
+                                <w:szCs w:val="18"/>
+                              </w:rPr>
+                            </w:pPr>
+                            <w:r>
+                              <w:rPr>
+                                <w:sz w:val="18"/>
+                                <w:szCs w:val="18"/>
+                              </w:rPr>
+                              <w:t xml:space="preserve">Figures </w:t>
+                            </w:r>
+                            <w:r>
+                              <w:rPr>
+                                <w:sz w:val="18"/>
+                                <w:szCs w:val="18"/>
+                              </w:rPr>
+                              <w:t>20</w:t>
+                            </w:r>
+                            <w:r>
+                              <w:rPr>
+                                <w:sz w:val="18"/>
+                                <w:szCs w:val="18"/>
+                              </w:rPr>
+                              <w:t>-</w:t>
+                            </w:r>
+                            <w:r>
+                              <w:rPr>
+                                <w:sz w:val="18"/>
+                                <w:szCs w:val="18"/>
+                              </w:rPr>
+                              <w:t>22</w:t>
+                            </w:r>
+                            <w:r>
+                              <w:rPr>
+                                <w:sz w:val="18"/>
+                                <w:szCs w:val="18"/>
+                              </w:rPr>
+                              <w:t xml:space="preserve">: Evaluation of the models using </w:t>
+                            </w:r>
+                            <w:r>
+                              <w:rPr>
+                                <w:sz w:val="18"/>
+                                <w:szCs w:val="18"/>
+                              </w:rPr>
+                              <w:t>general test set</w:t>
+                            </w:r>
+                          </w:p>
+                          <w:p/>
+                        </w:txbxContent>
+                      </wps:txbx>
+                      <wps:bodyPr rot="0" vert="horz" wrap="square" lIns="91440" tIns="45720" rIns="91440" bIns="45720" anchor="t" anchorCtr="0">
+                        <a:noAutofit/>
+                      </wps:bodyPr>
+                    </wps:wsp>
+                  </a:graphicData>
+                </a:graphic>
+                <wp14:sizeRelH relativeFrom="margin">
+                  <wp14:pctWidth>0</wp14:pctWidth>
+                </wp14:sizeRelH>
+                <wp14:sizeRelV relativeFrom="margin">
+                  <wp14:pctHeight>0</wp14:pctHeight>
+                </wp14:sizeRelV>
+              </wp:anchor>
+            </w:drawing>
+          </mc:Choice>
+          <mc:Fallback>
+            <w:pict>
+              <v:shape w14:anchorId="753F0A17" id="_x0000_s1048" type="#_x0000_t202" style="position:absolute;margin-left:0;margin-top:158.3pt;width:275.4pt;height:19.2pt;flip:x;z-index:251697152;visibility:visible;mso-wrap-style:square;mso-width-percent:0;mso-height-percent:0;mso-wrap-distance-left:9pt;mso-wrap-distance-top:3.6pt;mso-wrap-distance-right:9pt;mso-wrap-distance-bottom:3.6pt;mso-position-horizontal:left;mso-position-horizontal-relative:margin;mso-position-vertical:absolute;mso-position-vertical-relative:text;mso-width-percent:0;mso-height-percent:0;mso-width-relative:margin;mso-height-relative:margin;v-text-anchor:top" o:gfxdata="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" filled="f" stroked="f">
+                <v:textbox>
+                  <w:txbxContent>
+                    <w:p>
+                      <w:pPr>
+                        <w:bidi w:val="0"/>
+                        <w:rPr>
+                          <w:sz w:val="18"/>
+                          <w:szCs w:val="18"/>
+                        </w:rPr>
+                      </w:pPr>
+                      <w:r>
+                        <w:rPr>
+                          <w:sz w:val="18"/>
+                          <w:szCs w:val="18"/>
+                        </w:rPr>
+                        <w:t xml:space="preserve">Figures </w:t>
+                      </w:r>
+                      <w:r>
+                        <w:rPr>
+                          <w:sz w:val="18"/>
+                          <w:szCs w:val="18"/>
+                        </w:rPr>
+                        <w:t>20</w:t>
+                      </w:r>
+                      <w:r>
+                        <w:rPr>
+                          <w:sz w:val="18"/>
+                          <w:szCs w:val="18"/>
+                        </w:rPr>
+                        <w:t>-</w:t>
+                      </w:r>
+                      <w:r>
+                        <w:rPr>
+                          <w:sz w:val="18"/>
+                          <w:szCs w:val="18"/>
+                        </w:rPr>
+                        <w:t>22</w:t>
+                      </w:r>
+                      <w:r>
+                        <w:rPr>
+                          <w:sz w:val="18"/>
+                          <w:szCs w:val="18"/>
+                        </w:rPr>
+                        <w:t xml:space="preserve">: Evaluation of the models using </w:t>
+                      </w:r>
+                      <w:r>
+                        <w:rPr>
+                          <w:sz w:val="18"/>
+                          <w:szCs w:val="18"/>
+                        </w:rPr>
+                        <w:t>general test set</w:t>
+                      </w:r>
+                    </w:p>
+                    <w:p/>
+                  </w:txbxContent>
+                </v:textbox>
+                <w10:wrap type="square" anchorx="margin"/>
+              </v:shape>
+            </w:pict>
+          </mc:Fallback>
+        </mc:AlternateContent>
+      </w:r>
+      <w:r>
+        <w:rPr>
+          <w:rFonts w:asciiTheme="minorHAnsi" w:eastAsia="Times New Roman" w:hAnsiTheme="minorHAnsi"/>
+          <w:kern w:val="0"/>
+          <w:sz w:val="22"/>
+          <w:szCs w:val="22"/>
+          <w14:ligatures w14:val="none"/>
+        </w:rPr>
+        <w:br/>
+      </w:r>
+      <w:r>
+        <w:rPr>
+          <w:rFonts w:asciiTheme="minorHAnsi" w:eastAsia="Times New Roman" w:hAnsiTheme="minorHAnsi"/>
+          <w:kern w:val="0"/>
+          <w:sz w:val="22"/>
+          <w:szCs w:val="22"/>
+          <w14:ligatures w14:val="none"/>
+        </w:rPr>
+        <w:br/>
       </w:r>
     </w:p>
     <w:p>
@@ -6350,7 +8599,6 @@
           <w:iCs w:val="0"/>
           <w:color w:val="auto"/>
         </w:rPr>
-        <w:lastRenderedPageBreak/>
         <w:t>Results Analysis</w:t>
       </w:r>
     </w:p>
@@ -6359,167 +8607,217 @@
         <w:pStyle w:val="NormalWeb"/>
         <w:bidi w:val="0"/>
         <w:rPr>
-          <w:rFonts w:eastAsia="Times New Roman"/>
+          <w:rFonts w:asciiTheme="minorHAnsi" w:eastAsia="Times New Roman" w:hAnsiTheme="minorHAnsi"/>
           <w:kern w:val="0"/>
+          <w:sz w:val="22"/>
+          <w:szCs w:val="22"/>
           <w14:ligatures w14:val="none"/>
         </w:rPr>
       </w:pPr>
       <w:r>
         <w:rPr>
-          <w:rFonts w:eastAsia="Times New Roman"/>
+          <w:rFonts w:asciiTheme="minorHAnsi" w:eastAsia="Times New Roman" w:hAnsiTheme="minorHAnsi"/>
           <w:kern w:val="0"/>
+          <w:sz w:val="22"/>
+          <w:szCs w:val="22"/>
           <w14:ligatures w14:val="none"/>
         </w:rPr>
-        <w:t>Fine-tuning on the inpainting-based dataset yielded the best overall performance, achieving the highest accuracy, precision, and F1-score, and demonstrating strong alignment with both indoor and outdoor fall patterns. The Stable Diffusion-based model attained the highest AUC, indicating superior class separability despite slightly lower accuracy. In contrast, the Nano Banana-based model exhibited consistently lower performance, reflecting limited generalization relative to the other generative approaches. Training on the combined datasets led to performance degradation, likely due to domain mismatch and increased heterogeneity.</w:t>
-      </w:r>
-    </w:p>
-    <w:p>
-      <w:pPr>
-        <w:rPr>
-          <w:rFonts w:hint="cs"/>
+        <w:t xml:space="preserve">The evaluation on the general test set demonstrates clear differences in performance between the </w:t>
+      </w:r>
+      <w:proofErr w:type="gramStart"/>
+      <w:r>
+        <w:rPr>
+          <w:rFonts w:asciiTheme="minorHAnsi" w:eastAsia="Times New Roman" w:hAnsiTheme="minorHAnsi"/>
+          <w:kern w:val="0"/>
+          <w:sz w:val="22"/>
+          <w:szCs w:val="22"/>
+          <w14:ligatures w14:val="none"/>
+        </w:rPr>
+        <w:t>models fine-tuned</w:t>
+      </w:r>
+      <w:proofErr w:type="gramEnd"/>
+      <w:r>
+        <w:rPr>
+          <w:rFonts w:asciiTheme="minorHAnsi" w:eastAsia="Times New Roman" w:hAnsiTheme="minorHAnsi"/>
+          <w:kern w:val="0"/>
+          <w:sz w:val="22"/>
+          <w:szCs w:val="22"/>
+          <w14:ligatures w14:val="none"/>
+        </w:rPr>
+        <w:t xml:space="preserve"> on different synthetic datasets. Among all evaluated approaches, the LBFD-Net model fine-tuned on the Inpainting dataset achieved the best overall results, reaching the highest accuracy (0.8593), precision (0.8760), F1-score (0.8561), and a strong AUC value of 0.91. These results indicate that the inpainting-based synthetic data provided the most effective and reliable training samples, enabling the model to generalize better to a mixed test set consisting of both real indoor images and synthetic public-space images</w:t>
+      </w:r>
+      <w:r>
+        <w:rPr>
+          <w:rFonts w:asciiTheme="minorHAnsi" w:eastAsia="Times New Roman" w:hAnsiTheme="minorHAnsi"/>
+          <w:kern w:val="0"/>
+          <w:sz w:val="22"/>
+          <w:szCs w:val="22"/>
           <w:rtl/>
-        </w:rPr>
-      </w:pPr>
-    </w:p>
-    <w:p>
-      <w:pPr>
-        <w:bidi w:val="0"/>
-      </w:pPr>
-    </w:p>
-    <w:p>
-      <w:pPr>
-        <w:bidi w:val="0"/>
-      </w:pPr>
-    </w:p>
-    <w:p>
-      <w:pPr>
-        <w:bidi w:val="0"/>
-      </w:pPr>
-    </w:p>
-    <w:p>
-      <w:pPr>
-        <w:bidi w:val="0"/>
-      </w:pPr>
-    </w:p>
-    <w:p>
-      <w:pPr>
-        <w:bidi w:val="0"/>
-      </w:pPr>
-    </w:p>
-    <w:p>
-      <w:pPr>
-        <w:bidi w:val="0"/>
-      </w:pPr>
-    </w:p>
-    <w:p>
-      <w:pPr>
-        <w:bidi w:val="0"/>
-      </w:pPr>
-    </w:p>
-    <w:p>
-      <w:pPr>
-        <w:bidi w:val="0"/>
-      </w:pPr>
-    </w:p>
-    <w:p>
-      <w:pPr>
-        <w:bidi w:val="0"/>
-      </w:pPr>
-    </w:p>
-    <w:p>
-      <w:pPr>
-        <w:bidi w:val="0"/>
-      </w:pPr>
-    </w:p>
-    <w:p>
-      <w:pPr>
-        <w:bidi w:val="0"/>
-      </w:pPr>
-    </w:p>
-    <w:p>
-      <w:pPr>
-        <w:bidi w:val="0"/>
-      </w:pPr>
-    </w:p>
-    <w:p>
-      <w:pPr>
-        <w:bidi w:val="0"/>
-      </w:pPr>
-    </w:p>
-    <w:p>
-      <w:pPr>
-        <w:bidi w:val="0"/>
-      </w:pPr>
-    </w:p>
-    <w:p>
-      <w:pPr>
-        <w:bidi w:val="0"/>
-      </w:pPr>
-    </w:p>
-    <w:p>
-      <w:pPr>
-        <w:bidi w:val="0"/>
-      </w:pPr>
-    </w:p>
-    <w:p>
-      <w:pPr>
-        <w:bidi w:val="0"/>
-      </w:pPr>
-    </w:p>
-    <w:p>
-      <w:pPr>
-        <w:bidi w:val="0"/>
-      </w:pPr>
-    </w:p>
-    <w:p>
-      <w:pPr>
-        <w:bidi w:val="0"/>
-      </w:pPr>
-    </w:p>
-    <w:p>
-      <w:pPr>
-        <w:bidi w:val="0"/>
-      </w:pPr>
-    </w:p>
-    <w:p>
-      <w:pPr>
-        <w:bidi w:val="0"/>
-      </w:pPr>
-    </w:p>
-    <w:p>
-      <w:pPr>
-        <w:bidi w:val="0"/>
-      </w:pPr>
-    </w:p>
-    <w:p>
-      <w:pPr>
-        <w:bidi w:val="0"/>
-      </w:pPr>
-    </w:p>
-    <w:p>
-      <w:pPr>
-        <w:bidi w:val="0"/>
-      </w:pPr>
-    </w:p>
-    <w:p>
-      <w:pPr>
-        <w:bidi w:val="0"/>
-      </w:pPr>
-    </w:p>
-    <w:p>
-      <w:pPr>
-        <w:bidi w:val="0"/>
-      </w:pPr>
-    </w:p>
-    <w:p>
-      <w:pPr>
-        <w:bidi w:val="0"/>
-      </w:pPr>
-    </w:p>
-    <w:p>
-      <w:pPr>
-        <w:bidi w:val="0"/>
-      </w:pPr>
+          <w14:ligatures w14:val="none"/>
+        </w:rPr>
+        <w:t>.</w:t>
+      </w:r>
+    </w:p>
+    <w:p>
+      <w:pPr>
+        <w:pStyle w:val="NormalWeb"/>
+        <w:bidi w:val="0"/>
+        <w:rPr>
+          <w:rFonts w:asciiTheme="minorHAnsi" w:eastAsia="Times New Roman" w:hAnsiTheme="minorHAnsi"/>
+          <w:kern w:val="0"/>
+          <w:sz w:val="22"/>
+          <w:szCs w:val="22"/>
+          <w14:ligatures w14:val="none"/>
+        </w:rPr>
+      </w:pPr>
+      <w:r>
+        <w:rPr>
+          <w:rFonts w:asciiTheme="minorHAnsi" w:eastAsia="Times New Roman" w:hAnsiTheme="minorHAnsi"/>
+          <w:kern w:val="0"/>
+          <w:sz w:val="22"/>
+          <w:szCs w:val="22"/>
+          <w14:ligatures w14:val="none"/>
+        </w:rPr>
+        <w:t xml:space="preserve">The model fine-tuned on the Stable Diffusion dataset showed lower performance across most metrics, achieving an accuracy of 0.8111 and an AUC of 0.87. Although Stable Diffusion </w:t>
+      </w:r>
+      <w:proofErr w:type="gramStart"/>
+      <w:r>
+        <w:rPr>
+          <w:rFonts w:asciiTheme="minorHAnsi" w:eastAsia="Times New Roman" w:hAnsiTheme="minorHAnsi"/>
+          <w:kern w:val="0"/>
+          <w:sz w:val="22"/>
+          <w:szCs w:val="22"/>
+          <w14:ligatures w14:val="none"/>
+        </w:rPr>
+        <w:t>is capable of generating</w:t>
+      </w:r>
+      <w:proofErr w:type="gramEnd"/>
+      <w:r>
+        <w:rPr>
+          <w:rFonts w:asciiTheme="minorHAnsi" w:eastAsia="Times New Roman" w:hAnsiTheme="minorHAnsi"/>
+          <w:kern w:val="0"/>
+          <w:sz w:val="22"/>
+          <w:szCs w:val="22"/>
+          <w14:ligatures w14:val="none"/>
+        </w:rPr>
+        <w:t xml:space="preserve"> visually diverse and realistic images, the performance gap suggests that the synthetic images produced by this method may introduce domain shift and structural inconsistencies that negatively affect the learning process. As a result, the model trained on this dataset demonstrated weaker generalization to the combined test domain</w:t>
+      </w:r>
+      <w:r>
+        <w:rPr>
+          <w:rFonts w:asciiTheme="minorHAnsi" w:eastAsia="Times New Roman" w:hAnsiTheme="minorHAnsi"/>
+          <w:kern w:val="0"/>
+          <w:sz w:val="22"/>
+          <w:szCs w:val="22"/>
+          <w:rtl/>
+          <w14:ligatures w14:val="none"/>
+        </w:rPr>
+        <w:t>.</w:t>
+      </w:r>
+    </w:p>
+    <w:p>
+      <w:pPr>
+        <w:pStyle w:val="NormalWeb"/>
+        <w:bidi w:val="0"/>
+        <w:rPr>
+          <w:rFonts w:asciiTheme="minorHAnsi" w:eastAsia="Times New Roman" w:hAnsiTheme="minorHAnsi"/>
+          <w:kern w:val="0"/>
+          <w:sz w:val="22"/>
+          <w:szCs w:val="22"/>
+          <w14:ligatures w14:val="none"/>
+        </w:rPr>
+      </w:pPr>
+      <w:r>
+        <w:rPr>
+          <w:rFonts w:asciiTheme="minorHAnsi" w:eastAsia="Times New Roman" w:hAnsiTheme="minorHAnsi"/>
+          <w:kern w:val="0"/>
+          <w:sz w:val="22"/>
+          <w:szCs w:val="22"/>
+          <w14:ligatures w14:val="none"/>
+        </w:rPr>
+        <w:t>Similarly, the Nano Banana–based model achieved comparable accuracy (0.8111) but slightly better AUC (0.90) than the Stable Diffusion model. However, its F1-score (0.8118) and precision (0.8088) remained noticeably lower than those of the Inpainting-based model. This outcome suggests that while Nano Banana images may be visually coherent, they do not align as well with the real data distribution required for effective fall detection, limiting their usefulness for fine-tuning LBFD-Net</w:t>
+      </w:r>
+      <w:r>
+        <w:rPr>
+          <w:rFonts w:asciiTheme="minorHAnsi" w:eastAsia="Times New Roman" w:hAnsiTheme="minorHAnsi"/>
+          <w:kern w:val="0"/>
+          <w:sz w:val="22"/>
+          <w:szCs w:val="22"/>
+          <w:rtl/>
+          <w14:ligatures w14:val="none"/>
+        </w:rPr>
+        <w:t>.</w:t>
+      </w:r>
+      <w:r>
+        <w:rPr>
+          <w:rFonts w:asciiTheme="minorHAnsi" w:eastAsia="Times New Roman" w:hAnsiTheme="minorHAnsi"/>
+          <w:kern w:val="0"/>
+          <w:sz w:val="22"/>
+          <w:szCs w:val="22"/>
+          <w14:ligatures w14:val="none"/>
+        </w:rPr>
+        <w:t xml:space="preserve"> </w:t>
+      </w:r>
+    </w:p>
+    <w:p>
+      <w:pPr>
+        <w:pStyle w:val="NormalWeb"/>
+        <w:bidi w:val="0"/>
+        <w:rPr>
+          <w:rFonts w:asciiTheme="minorHAnsi" w:eastAsia="Times New Roman" w:hAnsiTheme="minorHAnsi"/>
+          <w:kern w:val="0"/>
+          <w:sz w:val="22"/>
+          <w:szCs w:val="22"/>
+          <w14:ligatures w14:val="none"/>
+        </w:rPr>
+      </w:pPr>
+      <w:r>
+        <w:rPr>
+          <w:rFonts w:asciiTheme="minorHAnsi" w:eastAsia="Times New Roman" w:hAnsiTheme="minorHAnsi"/>
+          <w:kern w:val="0"/>
+          <w:sz w:val="22"/>
+          <w:szCs w:val="22"/>
+          <w14:ligatures w14:val="none"/>
+        </w:rPr>
+        <w:t>Overall, these results reinforce the conclusion that the quality and domain alignment of synthetic data are more critical than visual realism alone.</w:t>
+      </w:r>
+      <w:r>
+        <w:rPr>
+          <w:rFonts w:asciiTheme="minorHAnsi" w:hAnsiTheme="minorHAnsi" w:cstheme="minorBidi"/>
+          <w:sz w:val="22"/>
+          <w:szCs w:val="22"/>
+        </w:rPr>
+        <w:t xml:space="preserve"> </w:t>
+      </w:r>
+      <w:r>
+        <w:rPr>
+          <w:rFonts w:asciiTheme="minorHAnsi" w:eastAsia="Times New Roman" w:hAnsiTheme="minorHAnsi"/>
+          <w:kern w:val="0"/>
+          <w:sz w:val="22"/>
+          <w:szCs w:val="22"/>
+          <w14:ligatures w14:val="none"/>
+        </w:rPr>
+        <w:t>The superior performance of the Inpainting-based approach indicates that preserving real scene structure and minimizing generative artifacts leads to more effective training data and, consequently, better model performance. In contrast, fully generative approaches, despite producing realistic-looking images, may introduce variability that reduces the model’s ability to generalize across real-world scenarios.</w:t>
+      </w:r>
+      <w:r>
+        <w:rPr>
+          <w:rFonts w:asciiTheme="minorHAnsi" w:eastAsia="Times New Roman" w:hAnsiTheme="minorHAnsi"/>
+          <w:kern w:val="0"/>
+          <w:sz w:val="22"/>
+          <w:szCs w:val="22"/>
+          <w14:ligatures w14:val="none"/>
+        </w:rPr>
+        <w:br/>
+      </w:r>
+      <w:r>
+        <w:rPr>
+          <w:rFonts w:asciiTheme="minorHAnsi" w:eastAsia="Times New Roman" w:hAnsiTheme="minorHAnsi"/>
+          <w:kern w:val="0"/>
+          <w:sz w:val="22"/>
+          <w:szCs w:val="22"/>
+          <w14:ligatures w14:val="none"/>
+        </w:rPr>
+        <w:br/>
+      </w:r>
     </w:p>
     <w:p>
       <w:pPr>
@@ -6529,6 +8827,7 @@
           <w:b/>
           <w:bCs/>
           <w:color w:val="auto"/>
+          <w:rtl/>
         </w:rPr>
       </w:pPr>
       <w:r>
@@ -6537,6 +8836,265 @@
           <w:bCs/>
           <w:color w:val="auto"/>
         </w:rPr>
+        <w:lastRenderedPageBreak/>
+        <w:t>Conclusion</w:t>
+      </w:r>
+      <w:r>
+        <w:rPr>
+          <w:b/>
+          <w:bCs/>
+          <w:color w:val="auto"/>
+        </w:rPr>
+        <w:t xml:space="preserve">s and </w:t>
+      </w:r>
+      <w:r>
+        <w:rPr>
+          <w:b/>
+          <w:bCs/>
+          <w:color w:val="auto"/>
+        </w:rPr>
+        <w:t>Discussion</w:t>
+      </w:r>
+    </w:p>
+    <w:p>
+      <w:pPr>
+        <w:bidi w:val="0"/>
+      </w:pPr>
+      <w:r>
+        <w:t>This study examined the contribution of synthetic data to improving fall detection performance through fine-tuning of the LBFD-Net model. The main objective was to evaluate whether generative models can be used to bridge the gap between controlled laboratory datasets and realistic public-space scenarios, by generating synthetic images that simulate falls under diverse real-world conditions.</w:t>
+      </w:r>
+    </w:p>
+    <w:p>
+      <w:pPr>
+        <w:bidi w:val="0"/>
+      </w:pPr>
+      <w:r>
+        <w:t>The experimental results clearly indicate that the type and quality of synthetic data have a substantial impact on model performance. Among all evaluated approaches, fine-tuning LBFD-Net using the Inpainting-based dataset consistently produced the best and most stable results. In the dedicated test set evaluation, this model achieved the highest Accuracy, Precision, and F1-score, demonstrating strong generalization to both real indoor images and synthetic images representing public environments.</w:t>
+      </w:r>
+    </w:p>
+    <w:p>
+      <w:pPr>
+        <w:bidi w:val="0"/>
+      </w:pPr>
+      <w:r>
+        <w:t>The primary reason for the superiority of the Inpainting approach lies in its ability to preserve the structure of the original scene. In this method, the background is based on real images, and the generation process focuses solely on inserting a person into a predefined masked region. As a result, critical aspects such as natural lighting, perspective, textures, and environmental details remain unchanged. Unlike fully generative models that create entire scenes from scratch, Inpainting produces training samples that are much closer to the distribution of real-world data, enabling the model to learn task-relevant patterns more effectively and reliably.</w:t>
+      </w:r>
+    </w:p>
+    <w:p>
+      <w:pPr>
+        <w:bidi w:val="0"/>
+      </w:pPr>
+      <w:r>
+        <w:t>Another significant advantage of the Inpainting approach is the reduction of generative hallucinations. General-purpose generative models, such as Stable Diffusion, may occasionally produce images containing anatomical distortions, inconsistent objects, or unrealistic spatial structures. Even minor artifacts of this kind can negatively affect the quality of training data and, consequently, the performance of classification networks. In contrast, Inpainting modifies only a small region of the image while leaving the majority untouched, resulting in cleaner, more coherent, and more trustworthy training samples. This characteristic directly contributed to the improved performance of the model trained on this dataset.</w:t>
+      </w:r>
+    </w:p>
+    <w:p>
+      <w:pPr>
+        <w:bidi w:val="0"/>
+      </w:pPr>
+      <w:r>
+        <w:t>The model fine-tuned using the Stable Diffusion dataset achieved the highest AUC score, indicating strong class separability. However, its overall performance was lower compared to the Inpainting-based model. This finding suggests that although Stable Diffusion can generate diverse and visually realistic images, the large variability and domain shift introduced by this method may hinder the model’s ability to learn stable and consistent representations for fall detection.</w:t>
+      </w:r>
+    </w:p>
+    <w:p>
+      <w:pPr>
+        <w:bidi w:val="0"/>
+      </w:pPr>
+      <w:r>
+        <w:t>The model trained on the Nano Banana dataset demonstrated the weakest performance among the evaluated approaches. While the generated images were visually coherent, they appeared to lack sufficient structural and contextual alignment with the target task, resulting in limited contribution to the discriminative capabilities of LBFD-Net.</w:t>
+      </w:r>
+    </w:p>
+    <w:p>
+      <w:pPr>
+        <w:bidi w:val="0"/>
+      </w:pPr>
+      <w:r>
+        <w:t xml:space="preserve">An additional important finding is that training on a combination of all synthetic datasets led to performance degradation. The mixed-dataset model achieved the lowest F1-score, indicating that excessive diversity and heterogeneity across domains can negatively affect learning rather than improve it. This result highlights that simply </w:t>
+      </w:r>
+      <w:r>
+        <w:lastRenderedPageBreak/>
+        <w:t>increasing the amount of data is not sufficient; careful domain alignment between synthetic samples and the target application is essential.</w:t>
+      </w:r>
+    </w:p>
+    <w:p>
+      <w:pPr>
+        <w:bidi w:val="0"/>
+      </w:pPr>
+      <w:r>
+        <w:t>The evaluation using the general test set, which combined real indoor images and synthetic samples, further reinforced these conclusions. Once again, the Inpainting-based model delivered the most balanced and consistent performance, confirming that this approach represents the most effective strategy for generating synthetic data for fall detection.</w:t>
+      </w:r>
+    </w:p>
+    <w:p>
+      <w:pPr>
+        <w:pStyle w:val="4"/>
+        <w:bidi w:val="0"/>
+        <w:rPr>
+          <w:b/>
+          <w:bCs/>
+          <w:i w:val="0"/>
+          <w:iCs w:val="0"/>
+          <w:color w:val="auto"/>
+        </w:rPr>
+      </w:pPr>
+      <w:r>
+        <w:rPr>
+          <w:b/>
+          <w:bCs/>
+          <w:i w:val="0"/>
+          <w:iCs w:val="0"/>
+          <w:color w:val="auto"/>
+        </w:rPr>
+        <w:t>Limitations</w:t>
+      </w:r>
+    </w:p>
+    <w:p>
+      <w:pPr>
+        <w:bidi w:val="0"/>
+      </w:pPr>
+      <w:r>
+        <w:t xml:space="preserve">Despite the promising findings, several limitations should be acknowledged. First, the study relied primarily on synthetic representations of public-space falls, as real-world datasets of this nature are currently unavailable. Second, computational and budget constraints </w:t>
+      </w:r>
+      <w:proofErr w:type="gramStart"/>
+      <w:r>
+        <w:t>limited</w:t>
+      </w:r>
+      <w:proofErr w:type="gramEnd"/>
+      <w:r>
+        <w:t xml:space="preserve"> the scale of image generation and experimentation. Finally, the study focused exclusively on the LBFD-Net architecture, and results may vary when applied to alternative fall detection models.</w:t>
+      </w:r>
+    </w:p>
+    <w:p>
+      <w:pPr>
+        <w:pStyle w:val="4"/>
+        <w:bidi w:val="0"/>
+        <w:rPr>
+          <w:b/>
+          <w:bCs/>
+          <w:i w:val="0"/>
+          <w:iCs w:val="0"/>
+          <w:color w:val="auto"/>
+        </w:rPr>
+      </w:pPr>
+      <w:r>
+        <w:rPr>
+          <w:b/>
+          <w:bCs/>
+          <w:i w:val="0"/>
+          <w:iCs w:val="0"/>
+          <w:color w:val="auto"/>
+        </w:rPr>
+        <w:t>Future Works</w:t>
+      </w:r>
+    </w:p>
+    <w:p>
+      <w:pPr>
+        <w:bidi w:val="0"/>
+      </w:pPr>
+      <w:r>
+        <w:t>Several directions can be explored to further extend and strengthen this research.</w:t>
+      </w:r>
+      <w:r>
+        <w:br/>
+        <w:t>First, expanding the synthetic datasets to include a larger number of scenes, camera angles, and environmental conditions could improve the robustness and generalization capabilities of the trained models.</w:t>
+      </w:r>
+    </w:p>
+    <w:p>
+      <w:pPr>
+        <w:bidi w:val="0"/>
+      </w:pPr>
+      <w:r>
+        <w:t>Second, future studies should aim to collect and evaluate real-world fall data from public spaces, if such data becomes available. Testing the models on genuine outdoor footage would provide a more realistic assessment of their practical applicability and help validate the effectiveness of synthetic training data.</w:t>
+      </w:r>
+    </w:p>
+    <w:p>
+      <w:pPr>
+        <w:bidi w:val="0"/>
+      </w:pPr>
+      <w:r>
+        <w:t>Finally, the same research methodology can be applied to alternative fall detection approaches, such as skeleton-based estimation and pose-analysis methods. Investigating whether generative data augmentation provides similar benefits for these techniques would contribute to a more comprehensive understanding of how synthetic data can support fall detection systems.</w:t>
+      </w:r>
+    </w:p>
+    <w:p>
+      <w:pPr>
+        <w:pStyle w:val="4"/>
+        <w:bidi w:val="0"/>
+        <w:rPr>
+          <w:b/>
+          <w:bCs/>
+          <w:i w:val="0"/>
+          <w:iCs w:val="0"/>
+          <w:color w:val="auto"/>
+        </w:rPr>
+      </w:pPr>
+      <w:r>
+        <w:rPr>
+          <w:b/>
+          <w:bCs/>
+          <w:i w:val="0"/>
+          <w:iCs w:val="0"/>
+          <w:color w:val="auto"/>
+        </w:rPr>
+        <w:t>Final Remarks</w:t>
+      </w:r>
+    </w:p>
+    <w:p>
+      <w:pPr>
+        <w:bidi w:val="0"/>
+      </w:pPr>
+      <w:r>
+        <w:t>The results of this research demonstrate that synthetic data can serve as an effective tool for enhancing fall detection systems, provided that the data are generated using appropriate and task-aware methods. The Inpainting approach proved to be the most successful strategy due to its ability to preserve real scene structure and avoid common generative hallucination issues. These findings emphasize the importance of domain-aware synthetic data generation, particularly in safety-critical computer vision applications.</w:t>
+      </w:r>
+    </w:p>
+    <w:p>
+      <w:pPr>
+        <w:bidi w:val="0"/>
+      </w:pPr>
+    </w:p>
+    <w:p>
+      <w:pPr>
+        <w:bidi w:val="0"/>
+      </w:pPr>
+    </w:p>
+    <w:p>
+      <w:pPr>
+        <w:bidi w:val="0"/>
+      </w:pPr>
+    </w:p>
+    <w:p>
+      <w:pPr>
+        <w:bidi w:val="0"/>
+      </w:pPr>
+    </w:p>
+    <w:p>
+      <w:pPr>
+        <w:pStyle w:val="NormalWeb"/>
+        <w:bidi w:val="0"/>
+        <w:rPr>
+          <w:rFonts w:asciiTheme="minorHAnsi" w:eastAsia="Times New Roman" w:hAnsiTheme="minorHAnsi"/>
+          <w:kern w:val="0"/>
+          <w:sz w:val="22"/>
+          <w:szCs w:val="22"/>
+          <w14:ligatures w14:val="none"/>
+        </w:rPr>
+      </w:pPr>
+    </w:p>
+    <w:p>
+      <w:pPr>
+        <w:pStyle w:val="3"/>
+        <w:bidi w:val="0"/>
+        <w:rPr>
+          <w:b/>
+          <w:bCs/>
+          <w:color w:val="auto"/>
+        </w:rPr>
+      </w:pPr>
+      <w:r>
+        <w:rPr>
+          <w:b/>
+          <w:bCs/>
+          <w:color w:val="auto"/>
+        </w:rPr>
+        <w:lastRenderedPageBreak/>
         <w:t>References</w:t>
       </w:r>
     </w:p>
@@ -6744,6 +9302,7 @@
       </w:pPr>
     </w:p>
     <w:sectPr>
+      <w:footerReference w:type="default" r:id="rId32"/>
       <w:pgSz w:w="11906" w:h="16838"/>
       <w:pgMar w:top="1440" w:right="1800" w:bottom="1440" w:left="1800" w:header="708" w:footer="708" w:gutter="0"/>
       <w:cols w:space="708"/>
@@ -6778,6 +9337,55 @@
     </w:p>
   </w:endnote>
 </w:endnotes>
+</file>
+
+<file path=word/footer1.xml><?xml version="1.0" encoding="utf-8"?>
+<w:ftr xmlns:wpc="http://schemas.microsoft.com/office/word/2010/wordprocessingCanvas" xmlns:cx="http://schemas.microsoft.com/office/drawing/2014/chartex" xmlns:cx1="http://schemas.microsoft.com/office/drawing/2015/9/8/chartex" xmlns:cx2="http://schemas.microsoft.com/office/drawing/2015/10/21/chartex" xmlns:cx3="http://schemas.microsoft.com/office/drawing/2016/5/9/chartex" xmlns:cx4="http://schemas.microsoft.com/office/drawing/2016/5/10/chartex" xmlns:cx5="http://schemas.microsoft.com/office/drawing/2016/5/11/chartex" xmlns:cx6="http://schemas.microsoft.com/office/drawing/2016/5/12/chartex" xmlns:cx7="http://schemas.microsoft.com/office/drawing/2016/5/13/chartex" xmlns:cx8="http://schemas.microsoft.com/office/drawing/2016/5/14/chartex" xmlns:mc="http://schemas.openxmlformats.org/markup-compatibility/2006" xmlns:aink="http://schemas.microsoft.com/office/drawing/2016/ink" xmlns:am3d="http://schemas.microsoft.com/office/drawing/2017/model3d" xmlns:o="urn:schemas-microsoft-com:office:office" xmlns:oel="http://schemas.microsoft.com/office/2019/extlst" xmlns:r="http://schemas.openxmlformats.org/officeDocument/2006/relationships" xmlns:m="http://schemas.openxmlformats.org/officeDocument/2006/math" xmlns:v="urn:schemas-microsoft-com:vml" xmlns:wp14="http://schemas.microsoft.com/office/word/2010/wordprocessingDrawing" xmlns:wp="http://schemas.openxmlformats.org/drawingml/2006/wordprocessingDrawing" xmlns:w10="urn:schemas-microsoft-com:office:word" xmlns:w="http://schemas.openxmlformats.org/wordprocessingml/2006/main" xmlns:w14="http://schemas.microsoft.com/office/word/2010/wordml" xmlns:w15="http://schemas.microsoft.com/office/word/2012/wordml" xmlns:w16cex="http://schemas.microsoft.com/office/word/2018/wordml/cex" xmlns:w16cid="http://schemas.microsoft.com/office/word/2016/wordml/cid" xmlns:w16="http://schemas.microsoft.com/office/word/2018/wordml" xmlns:w16du="http://schemas.microsoft.com/office/word/2023/wordml/word16du" xmlns:w16sdtdh="http://schemas.microsoft.com/office/word/2020/wordml/sdtdatahash" xmlns:w16sdtfl="http://schemas.microsoft.com/office/word/2024/wordml/sdtformatlock" xmlns:w16se="http://schemas.microsoft.com/office/word/2015/wordml/symex" xmlns:wpg="http://schemas.microsoft.com/office/word/2010/wordprocessingGroup" xmlns:wpi="http://schemas.microsoft.com/office/word/2010/wordprocessingInk" xmlns:wne="http://schemas.microsoft.com/office/word/2006/wordml" xmlns:wps="http://schemas.microsoft.com/office/word/2010/wordprocessingShape" mc:Ignorable="w14 w15 w16se w16cid w16 w16cex w16sdtdh w16sdtfl w16du wp14">
+  <w:sdt>
+    <w:sdtPr>
+      <w:rPr>
+        <w:rtl/>
+      </w:rPr>
+      <w:id w:val="1550264151"/>
+      <w:docPartObj>
+        <w:docPartGallery w:val="Page Numbers (Bottom of Page)"/>
+        <w:docPartUnique/>
+      </w:docPartObj>
+    </w:sdtPr>
+    <w:sdtContent>
+      <w:p>
+        <w:pPr>
+          <w:pStyle w:val="af1"/>
+          <w:jc w:val="center"/>
+        </w:pPr>
+        <w:r>
+          <w:fldChar w:fldCharType="begin"/>
+        </w:r>
+        <w:r>
+          <w:instrText>PAGE   \* MERGEFORMAT</w:instrText>
+        </w:r>
+        <w:r>
+          <w:fldChar w:fldCharType="separate"/>
+        </w:r>
+        <w:r>
+          <w:rPr>
+            <w:rtl/>
+            <w:lang w:val="he-IL"/>
+          </w:rPr>
+          <w:t>2</w:t>
+        </w:r>
+        <w:r>
+          <w:fldChar w:fldCharType="end"/>
+        </w:r>
+      </w:p>
+    </w:sdtContent>
+  </w:sdt>
+  <w:p>
+    <w:pPr>
+      <w:pStyle w:val="af1"/>
+    </w:pPr>
+  </w:p>
+</w:ftr>
 </file>
 
 <file path=word/footnotes.xml><?xml version="1.0" encoding="utf-8"?>
@@ -11175,7 +13783,6 @@
     <w:name w:val="Normal (Web)"/>
     <w:basedOn w:val="a"/>
     <w:uiPriority w:val="99"/>
-    <w:semiHidden/>
     <w:unhideWhenUsed/>
     <w:rsid w:val="00D928D7"/>
     <w:rPr>
@@ -11543,4 +14150,16 @@
     </a:ext>
   </a:extLst>
 </a:theme>
+</file>
+
+<file path=customXml/item1.xml><?xml version="1.0" encoding="utf-8"?>
+<b:Sources xmlns:b="http://schemas.openxmlformats.org/officeDocument/2006/bibliography" xmlns="http://schemas.openxmlformats.org/officeDocument/2006/bibliography" SelectedStyle="\APASixthEditionOfficeOnline.xsl" StyleName="APA" Version="6"/>
+</file>
+
+<file path=customXml/itemProps1.xml><?xml version="1.0" encoding="utf-8"?>
+<ds:datastoreItem xmlns:ds="http://schemas.openxmlformats.org/officeDocument/2006/customXml" ds:itemID="{EF4FF728-3304-47A5-AE19-8B4B7CD4F832}">
+  <ds:schemaRefs>
+    <ds:schemaRef ds:uri="http://schemas.openxmlformats.org/officeDocument/2006/bibliography"/>
+  </ds:schemaRefs>
+</ds:datastoreItem>
 </file>
</xml_diff>